<commit_message>
Fix fraction display and embed images in 50-question DOCX
</commit_message>
<xml_diff>
--- a/白堊紀冒險營_數學測驗50題.docx
+++ b/白堊紀冒險營_數學測驗50題.docx
@@ -68,7 +68,13 @@
         <w:rPr>
           <w:rFonts w:ascii="Microsoft JhengHei" w:hAnsi="Microsoft JhengHei"/>
         </w:rPr>
-        <w:t>1. 248是由幾個百、幾個十和幾個一組成的？</w:t>
+        <w:t xml:space="preserve">1. </w:t>
+      </w:r>
+      <w:r>
+        <w:rPr>
+          <w:rFonts w:ascii="Microsoft JhengHei" w:hAnsi="Microsoft JhengHei"/>
+        </w:rPr>
+        <w:t>248是由幾個百、幾個十和幾個一組成的？</w:t>
       </w:r>
     </w:p>
     <w:p>
@@ -80,7 +86,13 @@
         <w:rPr>
           <w:rFonts w:ascii="Microsoft JhengHei" w:hAnsi="Microsoft JhengHei"/>
         </w:rPr>
-        <w:t xml:space="preserve">   (A) 2個百、4個十和8個一</w:t>
+        <w:t xml:space="preserve">   (A) </w:t>
+      </w:r>
+      <w:r>
+        <w:rPr>
+          <w:rFonts w:ascii="Microsoft JhengHei" w:hAnsi="Microsoft JhengHei"/>
+        </w:rPr>
+        <w:t>2個百、4個十和8個一</w:t>
       </w:r>
     </w:p>
     <w:p>
@@ -92,7 +104,13 @@
         <w:rPr>
           <w:rFonts w:ascii="Microsoft JhengHei" w:hAnsi="Microsoft JhengHei"/>
         </w:rPr>
-        <w:t xml:space="preserve">   (B) 2個百、8個十和4個一</w:t>
+        <w:t xml:space="preserve">   (B) </w:t>
+      </w:r>
+      <w:r>
+        <w:rPr>
+          <w:rFonts w:ascii="Microsoft JhengHei" w:hAnsi="Microsoft JhengHei"/>
+        </w:rPr>
+        <w:t>2個百、8個十和4個一</w:t>
       </w:r>
     </w:p>
     <w:p>
@@ -104,7 +122,13 @@
         <w:rPr>
           <w:rFonts w:ascii="Microsoft JhengHei" w:hAnsi="Microsoft JhengHei"/>
         </w:rPr>
-        <w:t xml:space="preserve">   (C) 4個百、2個十和8個一</w:t>
+        <w:t xml:space="preserve">   (C) </w:t>
+      </w:r>
+      <w:r>
+        <w:rPr>
+          <w:rFonts w:ascii="Microsoft JhengHei" w:hAnsi="Microsoft JhengHei"/>
+        </w:rPr>
+        <w:t>4個百、2個十和8個一</w:t>
       </w:r>
     </w:p>
     <w:p>
@@ -116,7 +140,13 @@
         <w:rPr>
           <w:rFonts w:ascii="Microsoft JhengHei" w:hAnsi="Microsoft JhengHei"/>
         </w:rPr>
-        <w:t xml:space="preserve">   (D) 8個百、4個十和2個一</w:t>
+        <w:t xml:space="preserve">   (D) </w:t>
+      </w:r>
+      <w:r>
+        <w:rPr>
+          <w:rFonts w:ascii="Microsoft JhengHei" w:hAnsi="Microsoft JhengHei"/>
+        </w:rPr>
+        <w:t>8個百、4個十和2個一</w:t>
       </w:r>
     </w:p>
     <w:p>
@@ -128,7 +158,13 @@
         <w:rPr>
           <w:rFonts w:ascii="Microsoft JhengHei" w:hAnsi="Microsoft JhengHei"/>
         </w:rPr>
-        <w:t>2. 在「362」這個數中，百位的「3」代表多少？個位的「2」代表多少？</w:t>
+        <w:t xml:space="preserve">2. </w:t>
+      </w:r>
+      <w:r>
+        <w:rPr>
+          <w:rFonts w:ascii="Microsoft JhengHei" w:hAnsi="Microsoft JhengHei"/>
+        </w:rPr>
+        <w:t>在「362」這個數中，百位的「3」代表多少？個位的「2」代表多少？</w:t>
       </w:r>
     </w:p>
     <w:p>
@@ -140,7 +176,13 @@
         <w:rPr>
           <w:rFonts w:ascii="Microsoft JhengHei" w:hAnsi="Microsoft JhengHei"/>
         </w:rPr>
-        <w:t xml:space="preserve">   (A) 百位的「3」代表3，個位的「2」代表2</w:t>
+        <w:t xml:space="preserve">   (A) </w:t>
+      </w:r>
+      <w:r>
+        <w:rPr>
+          <w:rFonts w:ascii="Microsoft JhengHei" w:hAnsi="Microsoft JhengHei"/>
+        </w:rPr>
+        <w:t>百位的「3」代表3，個位的「2」代表2</w:t>
       </w:r>
     </w:p>
     <w:p>
@@ -152,7 +194,13 @@
         <w:rPr>
           <w:rFonts w:ascii="Microsoft JhengHei" w:hAnsi="Microsoft JhengHei"/>
         </w:rPr>
-        <w:t xml:space="preserve">   (B) 百位的「3」代表30，個位的「2」代表2</w:t>
+        <w:t xml:space="preserve">   (B) </w:t>
+      </w:r>
+      <w:r>
+        <w:rPr>
+          <w:rFonts w:ascii="Microsoft JhengHei" w:hAnsi="Microsoft JhengHei"/>
+        </w:rPr>
+        <w:t>百位的「3」代表30，個位的「2」代表2</w:t>
       </w:r>
     </w:p>
     <w:p>
@@ -164,7 +212,13 @@
         <w:rPr>
           <w:rFonts w:ascii="Microsoft JhengHei" w:hAnsi="Microsoft JhengHei"/>
         </w:rPr>
-        <w:t xml:space="preserve">   (C) 百位的「3」代表300，個位的「2」代表2</w:t>
+        <w:t xml:space="preserve">   (C) </w:t>
+      </w:r>
+      <w:r>
+        <w:rPr>
+          <w:rFonts w:ascii="Microsoft JhengHei" w:hAnsi="Microsoft JhengHei"/>
+        </w:rPr>
+        <w:t>百位的「3」代表300，個位的「2」代表2</w:t>
       </w:r>
     </w:p>
     <w:p>
@@ -176,7 +230,13 @@
         <w:rPr>
           <w:rFonts w:ascii="Microsoft JhengHei" w:hAnsi="Microsoft JhengHei"/>
         </w:rPr>
-        <w:t xml:space="preserve">   (D) 百位的「3」代表300，個位的「2」代表20</w:t>
+        <w:t xml:space="preserve">   (D) </w:t>
+      </w:r>
+      <w:r>
+        <w:rPr>
+          <w:rFonts w:ascii="Microsoft JhengHei" w:hAnsi="Microsoft JhengHei"/>
+        </w:rPr>
+        <w:t>百位的「3」代表300，個位的「2」代表20</w:t>
       </w:r>
     </w:p>
     <w:p>
@@ -188,7 +248,13 @@
         <w:rPr>
           <w:rFonts w:ascii="Microsoft JhengHei" w:hAnsi="Microsoft JhengHei"/>
         </w:rPr>
-        <w:t>3. 小華有3個百、5個十和7個一，合起來是多少元？</w:t>
+        <w:t xml:space="preserve">3. </w:t>
+      </w:r>
+      <w:r>
+        <w:rPr>
+          <w:rFonts w:ascii="Microsoft JhengHei" w:hAnsi="Microsoft JhengHei"/>
+        </w:rPr>
+        <w:t>小華有3個百、5個十和7個一，合起來是多少元？</w:t>
       </w:r>
     </w:p>
     <w:p>
@@ -200,7 +266,13 @@
         <w:rPr>
           <w:rFonts w:ascii="Microsoft JhengHei" w:hAnsi="Microsoft JhengHei"/>
         </w:rPr>
-        <w:t xml:space="preserve">   (A) 350元</w:t>
+        <w:t xml:space="preserve">   (A) </w:t>
+      </w:r>
+      <w:r>
+        <w:rPr>
+          <w:rFonts w:ascii="Microsoft JhengHei" w:hAnsi="Microsoft JhengHei"/>
+        </w:rPr>
+        <w:t>350元</w:t>
       </w:r>
     </w:p>
     <w:p>
@@ -212,7 +284,13 @@
         <w:rPr>
           <w:rFonts w:ascii="Microsoft JhengHei" w:hAnsi="Microsoft JhengHei"/>
         </w:rPr>
-        <w:t xml:space="preserve">   (B) 357元</w:t>
+        <w:t xml:space="preserve">   (B) </w:t>
+      </w:r>
+      <w:r>
+        <w:rPr>
+          <w:rFonts w:ascii="Microsoft JhengHei" w:hAnsi="Microsoft JhengHei"/>
+        </w:rPr>
+        <w:t>357元</w:t>
       </w:r>
     </w:p>
     <w:p>
@@ -224,7 +302,13 @@
         <w:rPr>
           <w:rFonts w:ascii="Microsoft JhengHei" w:hAnsi="Microsoft JhengHei"/>
         </w:rPr>
-        <w:t xml:space="preserve">   (C) 537元</w:t>
+        <w:t xml:space="preserve">   (C) </w:t>
+      </w:r>
+      <w:r>
+        <w:rPr>
+          <w:rFonts w:ascii="Microsoft JhengHei" w:hAnsi="Microsoft JhengHei"/>
+        </w:rPr>
+        <w:t>537元</w:t>
       </w:r>
     </w:p>
     <w:p>
@@ -236,7 +320,13 @@
         <w:rPr>
           <w:rFonts w:ascii="Microsoft JhengHei" w:hAnsi="Microsoft JhengHei"/>
         </w:rPr>
-        <w:t xml:space="preserve">   (D) 753元</w:t>
+        <w:t xml:space="preserve">   (D) </w:t>
+      </w:r>
+      <w:r>
+        <w:rPr>
+          <w:rFonts w:ascii="Microsoft JhengHei" w:hAnsi="Microsoft JhengHei"/>
+        </w:rPr>
+        <w:t>753元</w:t>
       </w:r>
     </w:p>
     <w:p>
@@ -262,7 +352,13 @@
         <w:rPr>
           <w:rFonts w:ascii="Microsoft JhengHei" w:hAnsi="Microsoft JhengHei"/>
         </w:rPr>
-        <w:t>4. 樹上有8隻小鳥，又飛來了7隻，現在一共有幾隻小鳥？</w:t>
+        <w:t xml:space="preserve">4. </w:t>
+      </w:r>
+      <w:r>
+        <w:rPr>
+          <w:rFonts w:ascii="Microsoft JhengHei" w:hAnsi="Microsoft JhengHei"/>
+        </w:rPr>
+        <w:t>樹上有8隻小鳥，又飛來了7隻，現在一共有幾隻小鳥？</w:t>
       </w:r>
     </w:p>
     <w:p>
@@ -274,7 +370,13 @@
         <w:rPr>
           <w:rFonts w:ascii="Microsoft JhengHei" w:hAnsi="Microsoft JhengHei"/>
         </w:rPr>
-        <w:t xml:space="preserve">   (A) 1隻</w:t>
+        <w:t xml:space="preserve">   (A) </w:t>
+      </w:r>
+      <w:r>
+        <w:rPr>
+          <w:rFonts w:ascii="Microsoft JhengHei" w:hAnsi="Microsoft JhengHei"/>
+        </w:rPr>
+        <w:t>1隻</w:t>
       </w:r>
     </w:p>
     <w:p>
@@ -286,7 +388,13 @@
         <w:rPr>
           <w:rFonts w:ascii="Microsoft JhengHei" w:hAnsi="Microsoft JhengHei"/>
         </w:rPr>
-        <w:t xml:space="preserve">   (B) 14隻</w:t>
+        <w:t xml:space="preserve">   (B) </w:t>
+      </w:r>
+      <w:r>
+        <w:rPr>
+          <w:rFonts w:ascii="Microsoft JhengHei" w:hAnsi="Microsoft JhengHei"/>
+        </w:rPr>
+        <w:t>14隻</w:t>
       </w:r>
     </w:p>
     <w:p>
@@ -298,7 +406,13 @@
         <w:rPr>
           <w:rFonts w:ascii="Microsoft JhengHei" w:hAnsi="Microsoft JhengHei"/>
         </w:rPr>
-        <w:t xml:space="preserve">   (C) 15隻</w:t>
+        <w:t xml:space="preserve">   (C) </w:t>
+      </w:r>
+      <w:r>
+        <w:rPr>
+          <w:rFonts w:ascii="Microsoft JhengHei" w:hAnsi="Microsoft JhengHei"/>
+        </w:rPr>
+        <w:t>15隻</w:t>
       </w:r>
     </w:p>
     <w:p>
@@ -310,7 +424,13 @@
         <w:rPr>
           <w:rFonts w:ascii="Microsoft JhengHei" w:hAnsi="Microsoft JhengHei"/>
         </w:rPr>
-        <w:t xml:space="preserve">   (D) 16隻</w:t>
+        <w:t xml:space="preserve">   (D) </w:t>
+      </w:r>
+      <w:r>
+        <w:rPr>
+          <w:rFonts w:ascii="Microsoft JhengHei" w:hAnsi="Microsoft JhengHei"/>
+        </w:rPr>
+        <w:t>16隻</w:t>
       </w:r>
     </w:p>
     <w:p>
@@ -322,7 +442,13 @@
         <w:rPr>
           <w:rFonts w:ascii="Microsoft JhengHei" w:hAnsi="Microsoft JhengHei"/>
         </w:rPr>
-        <w:t>5. 算式「14 - 9 = 5」中，被減數、減數和差分別是多少？</w:t>
+        <w:t xml:space="preserve">5. </w:t>
+      </w:r>
+      <w:r>
+        <w:rPr>
+          <w:rFonts w:ascii="Microsoft JhengHei" w:hAnsi="Microsoft JhengHei"/>
+        </w:rPr>
+        <w:t>算式「14 - 9 = 5」中，被減數、減數和差分別是多少？</w:t>
       </w:r>
     </w:p>
     <w:p>
@@ -334,7 +460,13 @@
         <w:rPr>
           <w:rFonts w:ascii="Microsoft JhengHei" w:hAnsi="Microsoft JhengHei"/>
         </w:rPr>
-        <w:t xml:space="preserve">   (A) 被減數是14，減數是9，差是5</w:t>
+        <w:t xml:space="preserve">   (A) </w:t>
+      </w:r>
+      <w:r>
+        <w:rPr>
+          <w:rFonts w:ascii="Microsoft JhengHei" w:hAnsi="Microsoft JhengHei"/>
+        </w:rPr>
+        <w:t>被減數是14，減數是9，差是5</w:t>
       </w:r>
     </w:p>
     <w:p>
@@ -346,7 +478,13 @@
         <w:rPr>
           <w:rFonts w:ascii="Microsoft JhengHei" w:hAnsi="Microsoft JhengHei"/>
         </w:rPr>
-        <w:t xml:space="preserve">   (B) 被減數是9，減數是14，差是5</w:t>
+        <w:t xml:space="preserve">   (B) </w:t>
+      </w:r>
+      <w:r>
+        <w:rPr>
+          <w:rFonts w:ascii="Microsoft JhengHei" w:hAnsi="Microsoft JhengHei"/>
+        </w:rPr>
+        <w:t>被減數是9，減數是14，差是5</w:t>
       </w:r>
     </w:p>
     <w:p>
@@ -358,7 +496,13 @@
         <w:rPr>
           <w:rFonts w:ascii="Microsoft JhengHei" w:hAnsi="Microsoft JhengHei"/>
         </w:rPr>
-        <w:t xml:space="preserve">   (C) 被減數是5，減數是9，差是14</w:t>
+        <w:t xml:space="preserve">   (C) </w:t>
+      </w:r>
+      <w:r>
+        <w:rPr>
+          <w:rFonts w:ascii="Microsoft JhengHei" w:hAnsi="Microsoft JhengHei"/>
+        </w:rPr>
+        <w:t>被減數是5，減數是9，差是14</w:t>
       </w:r>
     </w:p>
     <w:p>
@@ -370,7 +514,13 @@
         <w:rPr>
           <w:rFonts w:ascii="Microsoft JhengHei" w:hAnsi="Microsoft JhengHei"/>
         </w:rPr>
-        <w:t xml:space="preserve">   (D) 被減數是14，減數是5，差是9</w:t>
+        <w:t xml:space="preserve">   (D) </w:t>
+      </w:r>
+      <w:r>
+        <w:rPr>
+          <w:rFonts w:ascii="Microsoft JhengHei" w:hAnsi="Microsoft JhengHei"/>
+        </w:rPr>
+        <w:t>被減數是14，減數是5，差是9</w:t>
       </w:r>
     </w:p>
     <w:p>
@@ -382,7 +532,13 @@
         <w:rPr>
           <w:rFonts w:ascii="Microsoft JhengHei" w:hAnsi="Microsoft JhengHei"/>
         </w:rPr>
-        <w:t>6. 算算看「12 - 7 = ( )」，括號裡應該填入多少？並用哪一個加法算式驗算才正確？</w:t>
+        <w:t xml:space="preserve">6. </w:t>
+      </w:r>
+      <w:r>
+        <w:rPr>
+          <w:rFonts w:ascii="Microsoft JhengHei" w:hAnsi="Microsoft JhengHei"/>
+        </w:rPr>
+        <w:t>算算看「12 - 7 = ( )」，括號裡應該填入多少？並用哪一個加法算式驗算才正確？</w:t>
       </w:r>
     </w:p>
     <w:p>
@@ -394,7 +550,13 @@
         <w:rPr>
           <w:rFonts w:ascii="Microsoft JhengHei" w:hAnsi="Microsoft JhengHei"/>
         </w:rPr>
-        <w:t xml:space="preserve">   (A) 5，驗算：5 + 7 = 12</w:t>
+        <w:t xml:space="preserve">   (A) </w:t>
+      </w:r>
+      <w:r>
+        <w:rPr>
+          <w:rFonts w:ascii="Microsoft JhengHei" w:hAnsi="Microsoft JhengHei"/>
+        </w:rPr>
+        <w:t>5，驗算：5 + 7 = 12</w:t>
       </w:r>
     </w:p>
     <w:p>
@@ -406,7 +568,13 @@
         <w:rPr>
           <w:rFonts w:ascii="Microsoft JhengHei" w:hAnsi="Microsoft JhengHei"/>
         </w:rPr>
-        <w:t xml:space="preserve">   (B) 5，驗算：5 + 12 = 17</w:t>
+        <w:t xml:space="preserve">   (B) </w:t>
+      </w:r>
+      <w:r>
+        <w:rPr>
+          <w:rFonts w:ascii="Microsoft JhengHei" w:hAnsi="Microsoft JhengHei"/>
+        </w:rPr>
+        <w:t>5，驗算：5 + 12 = 17</w:t>
       </w:r>
     </w:p>
     <w:p>
@@ -418,7 +586,13 @@
         <w:rPr>
           <w:rFonts w:ascii="Microsoft JhengHei" w:hAnsi="Microsoft JhengHei"/>
         </w:rPr>
-        <w:t xml:space="preserve">   (C) 6，驗算：6 + 7 = 13</w:t>
+        <w:t xml:space="preserve">   (C) </w:t>
+      </w:r>
+      <w:r>
+        <w:rPr>
+          <w:rFonts w:ascii="Microsoft JhengHei" w:hAnsi="Microsoft JhengHei"/>
+        </w:rPr>
+        <w:t>6，驗算：6 + 7 = 13</w:t>
       </w:r>
     </w:p>
     <w:p>
@@ -430,7 +604,13 @@
         <w:rPr>
           <w:rFonts w:ascii="Microsoft JhengHei" w:hAnsi="Microsoft JhengHei"/>
         </w:rPr>
-        <w:t xml:space="preserve">   (D) 6，驗算：6 + 6 = 12</w:t>
+        <w:t xml:space="preserve">   (D) </w:t>
+      </w:r>
+      <w:r>
+        <w:rPr>
+          <w:rFonts w:ascii="Microsoft JhengHei" w:hAnsi="Microsoft JhengHei"/>
+        </w:rPr>
+        <w:t>6，驗算：6 + 6 = 12</w:t>
       </w:r>
     </w:p>
     <w:p>
@@ -442,7 +622,13 @@
         <w:rPr>
           <w:rFonts w:ascii="Microsoft JhengHei" w:hAnsi="Microsoft JhengHei"/>
         </w:rPr>
-        <w:t>7. 抽屜裡有15支鉛筆，拿走了6支，還剩下幾支鉛筆？</w:t>
+        <w:t xml:space="preserve">7. </w:t>
+      </w:r>
+      <w:r>
+        <w:rPr>
+          <w:rFonts w:ascii="Microsoft JhengHei" w:hAnsi="Microsoft JhengHei"/>
+        </w:rPr>
+        <w:t>抽屜裡有15支鉛筆，拿走了6支，還剩下幾支鉛筆？</w:t>
       </w:r>
     </w:p>
     <w:p>
@@ -454,7 +640,13 @@
         <w:rPr>
           <w:rFonts w:ascii="Microsoft JhengHei" w:hAnsi="Microsoft JhengHei"/>
         </w:rPr>
-        <w:t xml:space="preserve">   (A) 8支</w:t>
+        <w:t xml:space="preserve">   (A) </w:t>
+      </w:r>
+      <w:r>
+        <w:rPr>
+          <w:rFonts w:ascii="Microsoft JhengHei" w:hAnsi="Microsoft JhengHei"/>
+        </w:rPr>
+        <w:t>8支</w:t>
       </w:r>
     </w:p>
     <w:p>
@@ -466,7 +658,13 @@
         <w:rPr>
           <w:rFonts w:ascii="Microsoft JhengHei" w:hAnsi="Microsoft JhengHei"/>
         </w:rPr>
-        <w:t xml:space="preserve">   (B) 9支</w:t>
+        <w:t xml:space="preserve">   (B) </w:t>
+      </w:r>
+      <w:r>
+        <w:rPr>
+          <w:rFonts w:ascii="Microsoft JhengHei" w:hAnsi="Microsoft JhengHei"/>
+        </w:rPr>
+        <w:t>9支</w:t>
       </w:r>
     </w:p>
     <w:p>
@@ -478,7 +676,13 @@
         <w:rPr>
           <w:rFonts w:ascii="Microsoft JhengHei" w:hAnsi="Microsoft JhengHei"/>
         </w:rPr>
-        <w:t xml:space="preserve">   (C) 10支</w:t>
+        <w:t xml:space="preserve">   (C) </w:t>
+      </w:r>
+      <w:r>
+        <w:rPr>
+          <w:rFonts w:ascii="Microsoft JhengHei" w:hAnsi="Microsoft JhengHei"/>
+        </w:rPr>
+        <w:t>10支</w:t>
       </w:r>
     </w:p>
     <w:p>
@@ -490,7 +694,13 @@
         <w:rPr>
           <w:rFonts w:ascii="Microsoft JhengHei" w:hAnsi="Microsoft JhengHei"/>
         </w:rPr>
-        <w:t xml:space="preserve">   (D) 21支</w:t>
+        <w:t xml:space="preserve">   (D) </w:t>
+      </w:r>
+      <w:r>
+        <w:rPr>
+          <w:rFonts w:ascii="Microsoft JhengHei" w:hAnsi="Microsoft JhengHei"/>
+        </w:rPr>
+        <w:t>21支</w:t>
       </w:r>
     </w:p>
     <w:p>
@@ -516,7 +726,13 @@
         <w:rPr>
           <w:rFonts w:ascii="Microsoft JhengHei" w:hAnsi="Microsoft JhengHei"/>
         </w:rPr>
-        <w:t>8. 一個麵包28元，一瓶牛奶32元，媽媽帶了60元，大約夠不夠買？請用十位估算回答。</w:t>
+        <w:t xml:space="preserve">8. </w:t>
+      </w:r>
+      <w:r>
+        <w:rPr>
+          <w:rFonts w:ascii="Microsoft JhengHei" w:hAnsi="Microsoft JhengHei"/>
+        </w:rPr>
+        <w:t>一個麵包28元，一瓶牛奶32元，媽媽帶了60元，大約夠不夠買？請用十位估算回答。</w:t>
       </w:r>
     </w:p>
     <w:p>
@@ -528,7 +744,13 @@
         <w:rPr>
           <w:rFonts w:ascii="Microsoft JhengHei" w:hAnsi="Microsoft JhengHei"/>
         </w:rPr>
-        <w:t xml:space="preserve">   (A) 夠買，大約需要60元</w:t>
+        <w:t xml:space="preserve">   (A) </w:t>
+      </w:r>
+      <w:r>
+        <w:rPr>
+          <w:rFonts w:ascii="Microsoft JhengHei" w:hAnsi="Microsoft JhengHei"/>
+        </w:rPr>
+        <w:t>夠買，大約需要60元</w:t>
       </w:r>
     </w:p>
     <w:p>
@@ -540,7 +762,13 @@
         <w:rPr>
           <w:rFonts w:ascii="Microsoft JhengHei" w:hAnsi="Microsoft JhengHei"/>
         </w:rPr>
-        <w:t xml:space="preserve">   (B) 不夠買，大約需要60元</w:t>
+        <w:t xml:space="preserve">   (B) </w:t>
+      </w:r>
+      <w:r>
+        <w:rPr>
+          <w:rFonts w:ascii="Microsoft JhengHei" w:hAnsi="Microsoft JhengHei"/>
+        </w:rPr>
+        <w:t>不夠買，大約需要60元</w:t>
       </w:r>
     </w:p>
     <w:p>
@@ -552,7 +780,13 @@
         <w:rPr>
           <w:rFonts w:ascii="Microsoft JhengHei" w:hAnsi="Microsoft JhengHei"/>
         </w:rPr>
-        <w:t xml:space="preserve">   (C) 夠買，大約需要50元</w:t>
+        <w:t xml:space="preserve">   (C) </w:t>
+      </w:r>
+      <w:r>
+        <w:rPr>
+          <w:rFonts w:ascii="Microsoft JhengHei" w:hAnsi="Microsoft JhengHei"/>
+        </w:rPr>
+        <w:t>夠買，大約需要50元</w:t>
       </w:r>
     </w:p>
     <w:p>
@@ -564,7 +798,13 @@
         <w:rPr>
           <w:rFonts w:ascii="Microsoft JhengHei" w:hAnsi="Microsoft JhengHei"/>
         </w:rPr>
-        <w:t xml:space="preserve">   (D) 不夠買，大約需要70元</w:t>
+        <w:t xml:space="preserve">   (D) </w:t>
+      </w:r>
+      <w:r>
+        <w:rPr>
+          <w:rFonts w:ascii="Microsoft JhengHei" w:hAnsi="Microsoft JhengHei"/>
+        </w:rPr>
+        <w:t>不夠買，大約需要70元</w:t>
       </w:r>
     </w:p>
     <w:p>
@@ -576,7 +816,13 @@
         <w:rPr>
           <w:rFonts w:ascii="Microsoft JhengHei" w:hAnsi="Microsoft JhengHei"/>
         </w:rPr>
-        <w:t>9. 公車上原本有34人，下車了12人，又上車了8人，現在公車上有幾人？</w:t>
+        <w:t xml:space="preserve">9. </w:t>
+      </w:r>
+      <w:r>
+        <w:rPr>
+          <w:rFonts w:ascii="Microsoft JhengHei" w:hAnsi="Microsoft JhengHei"/>
+        </w:rPr>
+        <w:t>公車上原本有34人，下車了12人，又上車了8人，現在公車上有幾人？</w:t>
       </w:r>
     </w:p>
     <w:p>
@@ -588,7 +834,13 @@
         <w:rPr>
           <w:rFonts w:ascii="Microsoft JhengHei" w:hAnsi="Microsoft JhengHei"/>
         </w:rPr>
-        <w:t xml:space="preserve">   (A) 14人</w:t>
+        <w:t xml:space="preserve">   (A) </w:t>
+      </w:r>
+      <w:r>
+        <w:rPr>
+          <w:rFonts w:ascii="Microsoft JhengHei" w:hAnsi="Microsoft JhengHei"/>
+        </w:rPr>
+        <w:t>14人</w:t>
       </w:r>
     </w:p>
     <w:p>
@@ -600,7 +852,13 @@
         <w:rPr>
           <w:rFonts w:ascii="Microsoft JhengHei" w:hAnsi="Microsoft JhengHei"/>
         </w:rPr>
-        <w:t xml:space="preserve">   (B) 22人</w:t>
+        <w:t xml:space="preserve">   (B) </w:t>
+      </w:r>
+      <w:r>
+        <w:rPr>
+          <w:rFonts w:ascii="Microsoft JhengHei" w:hAnsi="Microsoft JhengHei"/>
+        </w:rPr>
+        <w:t>22人</w:t>
       </w:r>
     </w:p>
     <w:p>
@@ -612,7 +870,13 @@
         <w:rPr>
           <w:rFonts w:ascii="Microsoft JhengHei" w:hAnsi="Microsoft JhengHei"/>
         </w:rPr>
-        <w:t xml:space="preserve">   (C) 30人</w:t>
+        <w:t xml:space="preserve">   (C) </w:t>
+      </w:r>
+      <w:r>
+        <w:rPr>
+          <w:rFonts w:ascii="Microsoft JhengHei" w:hAnsi="Microsoft JhengHei"/>
+        </w:rPr>
+        <w:t>30人</w:t>
       </w:r>
     </w:p>
     <w:p>
@@ -624,7 +888,13 @@
         <w:rPr>
           <w:rFonts w:ascii="Microsoft JhengHei" w:hAnsi="Microsoft JhengHei"/>
         </w:rPr>
-        <w:t xml:space="preserve">   (D) 38人</w:t>
+        <w:t xml:space="preserve">   (D) </w:t>
+      </w:r>
+      <w:r>
+        <w:rPr>
+          <w:rFonts w:ascii="Microsoft JhengHei" w:hAnsi="Microsoft JhengHei"/>
+        </w:rPr>
+        <w:t>38人</w:t>
       </w:r>
     </w:p>
     <w:p>
@@ -636,7 +906,13 @@
         <w:rPr>
           <w:rFonts w:ascii="Microsoft JhengHei" w:hAnsi="Microsoft JhengHei"/>
         </w:rPr>
-        <w:t>10. 小花有50元，買了一枝15元的鉛筆，老闆要找回她幾元？</w:t>
+        <w:t xml:space="preserve">10. </w:t>
+      </w:r>
+      <w:r>
+        <w:rPr>
+          <w:rFonts w:ascii="Microsoft JhengHei" w:hAnsi="Microsoft JhengHei"/>
+        </w:rPr>
+        <w:t>小花有50元，買了一枝15元的鉛筆，老闆要找回她幾元？</w:t>
       </w:r>
     </w:p>
     <w:p>
@@ -648,7 +924,13 @@
         <w:rPr>
           <w:rFonts w:ascii="Microsoft JhengHei" w:hAnsi="Microsoft JhengHei"/>
         </w:rPr>
-        <w:t xml:space="preserve">   (A) 25元</w:t>
+        <w:t xml:space="preserve">   (A) </w:t>
+      </w:r>
+      <w:r>
+        <w:rPr>
+          <w:rFonts w:ascii="Microsoft JhengHei" w:hAnsi="Microsoft JhengHei"/>
+        </w:rPr>
+        <w:t>25元</w:t>
       </w:r>
     </w:p>
     <w:p>
@@ -660,7 +942,13 @@
         <w:rPr>
           <w:rFonts w:ascii="Microsoft JhengHei" w:hAnsi="Microsoft JhengHei"/>
         </w:rPr>
-        <w:t xml:space="preserve">   (B) 35元</w:t>
+        <w:t xml:space="preserve">   (B) </w:t>
+      </w:r>
+      <w:r>
+        <w:rPr>
+          <w:rFonts w:ascii="Microsoft JhengHei" w:hAnsi="Microsoft JhengHei"/>
+        </w:rPr>
+        <w:t>35元</w:t>
       </w:r>
     </w:p>
     <w:p>
@@ -672,7 +960,13 @@
         <w:rPr>
           <w:rFonts w:ascii="Microsoft JhengHei" w:hAnsi="Microsoft JhengHei"/>
         </w:rPr>
-        <w:t xml:space="preserve">   (C) 45元</w:t>
+        <w:t xml:space="preserve">   (C) </w:t>
+      </w:r>
+      <w:r>
+        <w:rPr>
+          <w:rFonts w:ascii="Microsoft JhengHei" w:hAnsi="Microsoft JhengHei"/>
+        </w:rPr>
+        <w:t>45元</w:t>
       </w:r>
     </w:p>
     <w:p>
@@ -684,7 +978,13 @@
         <w:rPr>
           <w:rFonts w:ascii="Microsoft JhengHei" w:hAnsi="Microsoft JhengHei"/>
         </w:rPr>
-        <w:t xml:space="preserve">   (D) 65元</w:t>
+        <w:t xml:space="preserve">   (D) </w:t>
+      </w:r>
+      <w:r>
+        <w:rPr>
+          <w:rFonts w:ascii="Microsoft JhengHei" w:hAnsi="Microsoft JhengHei"/>
+        </w:rPr>
+        <w:t>65元</w:t>
       </w:r>
     </w:p>
     <w:p>
@@ -710,7 +1010,13 @@
         <w:rPr>
           <w:rFonts w:ascii="Microsoft JhengHei" w:hAnsi="Microsoft JhengHei"/>
         </w:rPr>
-        <w:t>11. 一隻青蛙有4條腿，7隻青蛙一共有幾條腿？</w:t>
+        <w:t xml:space="preserve">11. </w:t>
+      </w:r>
+      <w:r>
+        <w:rPr>
+          <w:rFonts w:ascii="Microsoft JhengHei" w:hAnsi="Microsoft JhengHei"/>
+        </w:rPr>
+        <w:t>一隻青蛙有4條腿，7隻青蛙一共有幾條腿？</w:t>
       </w:r>
     </w:p>
     <w:p>
@@ -722,7 +1028,13 @@
         <w:rPr>
           <w:rFonts w:ascii="Microsoft JhengHei" w:hAnsi="Microsoft JhengHei"/>
         </w:rPr>
-        <w:t xml:space="preserve">   (A) 11條</w:t>
+        <w:t xml:space="preserve">   (A) </w:t>
+      </w:r>
+      <w:r>
+        <w:rPr>
+          <w:rFonts w:ascii="Microsoft JhengHei" w:hAnsi="Microsoft JhengHei"/>
+        </w:rPr>
+        <w:t>11條</w:t>
       </w:r>
     </w:p>
     <w:p>
@@ -734,7 +1046,13 @@
         <w:rPr>
           <w:rFonts w:ascii="Microsoft JhengHei" w:hAnsi="Microsoft JhengHei"/>
         </w:rPr>
-        <w:t xml:space="preserve">   (B) 24條</w:t>
+        <w:t xml:space="preserve">   (B) </w:t>
+      </w:r>
+      <w:r>
+        <w:rPr>
+          <w:rFonts w:ascii="Microsoft JhengHei" w:hAnsi="Microsoft JhengHei"/>
+        </w:rPr>
+        <w:t>24條</w:t>
       </w:r>
     </w:p>
     <w:p>
@@ -746,7 +1064,13 @@
         <w:rPr>
           <w:rFonts w:ascii="Microsoft JhengHei" w:hAnsi="Microsoft JhengHei"/>
         </w:rPr>
-        <w:t xml:space="preserve">   (C) 28條</w:t>
+        <w:t xml:space="preserve">   (C) </w:t>
+      </w:r>
+      <w:r>
+        <w:rPr>
+          <w:rFonts w:ascii="Microsoft JhengHei" w:hAnsi="Microsoft JhengHei"/>
+        </w:rPr>
+        <w:t>28條</w:t>
       </w:r>
     </w:p>
     <w:p>
@@ -758,7 +1082,13 @@
         <w:rPr>
           <w:rFonts w:ascii="Microsoft JhengHei" w:hAnsi="Microsoft JhengHei"/>
         </w:rPr>
-        <w:t xml:space="preserve">   (D) 32條</w:t>
+        <w:t xml:space="preserve">   (D) </w:t>
+      </w:r>
+      <w:r>
+        <w:rPr>
+          <w:rFonts w:ascii="Microsoft JhengHei" w:hAnsi="Microsoft JhengHei"/>
+        </w:rPr>
+        <w:t>32條</w:t>
       </w:r>
     </w:p>
     <w:p>
@@ -770,7 +1100,13 @@
         <w:rPr>
           <w:rFonts w:ascii="Microsoft JhengHei" w:hAnsi="Microsoft JhengHei"/>
         </w:rPr>
-        <w:t>12. 「8的3倍」是幾個8相加？寫成乘法算式是什麼？</w:t>
+        <w:t xml:space="preserve">12. </w:t>
+      </w:r>
+      <w:r>
+        <w:rPr>
+          <w:rFonts w:ascii="Microsoft JhengHei" w:hAnsi="Microsoft JhengHei"/>
+        </w:rPr>
+        <w:t>「8的3倍」是幾個8相加？寫成乘法算式是什麼？</w:t>
       </w:r>
     </w:p>
     <w:p>
@@ -782,7 +1118,13 @@
         <w:rPr>
           <w:rFonts w:ascii="Microsoft JhengHei" w:hAnsi="Microsoft JhengHei"/>
         </w:rPr>
-        <w:t xml:space="preserve">   (A) 3個8相加；8 × 3 = 24</w:t>
+        <w:t xml:space="preserve">   (A) </w:t>
+      </w:r>
+      <w:r>
+        <w:rPr>
+          <w:rFonts w:ascii="Microsoft JhengHei" w:hAnsi="Microsoft JhengHei"/>
+        </w:rPr>
+        <w:t>3個8相加；8 × 3 = 24</w:t>
       </w:r>
     </w:p>
     <w:p>
@@ -794,7 +1136,13 @@
         <w:rPr>
           <w:rFonts w:ascii="Microsoft JhengHei" w:hAnsi="Microsoft JhengHei"/>
         </w:rPr>
-        <w:t xml:space="preserve">   (B) 8個3相加；3 × 8 = 24</w:t>
+        <w:t xml:space="preserve">   (B) </w:t>
+      </w:r>
+      <w:r>
+        <w:rPr>
+          <w:rFonts w:ascii="Microsoft JhengHei" w:hAnsi="Microsoft JhengHei"/>
+        </w:rPr>
+        <w:t>8個3相加；3 × 8 = 24</w:t>
       </w:r>
     </w:p>
     <w:p>
@@ -806,7 +1154,13 @@
         <w:rPr>
           <w:rFonts w:ascii="Microsoft JhengHei" w:hAnsi="Microsoft JhengHei"/>
         </w:rPr>
-        <w:t xml:space="preserve">   (C) 3個8相加；8 + 3 = 11</w:t>
+        <w:t xml:space="preserve">   (C) </w:t>
+      </w:r>
+      <w:r>
+        <w:rPr>
+          <w:rFonts w:ascii="Microsoft JhengHei" w:hAnsi="Microsoft JhengHei"/>
+        </w:rPr>
+        <w:t>3個8相加；8 + 3 = 11</w:t>
       </w:r>
     </w:p>
     <w:p>
@@ -818,7 +1172,13 @@
         <w:rPr>
           <w:rFonts w:ascii="Microsoft JhengHei" w:hAnsi="Microsoft JhengHei"/>
         </w:rPr>
-        <w:t xml:space="preserve">   (D) 8個3相加；8 × 3 = 24</w:t>
+        <w:t xml:space="preserve">   (D) </w:t>
+      </w:r>
+      <w:r>
+        <w:rPr>
+          <w:rFonts w:ascii="Microsoft JhengHei" w:hAnsi="Microsoft JhengHei"/>
+        </w:rPr>
+        <w:t>8個3相加；8 × 3 = 24</w:t>
       </w:r>
     </w:p>
     <w:p>
@@ -830,7 +1190,13 @@
         <w:rPr>
           <w:rFonts w:ascii="Microsoft JhengHei" w:hAnsi="Microsoft JhengHei"/>
         </w:rPr>
-        <w:t>13. 老師有12顆糖果，平分給4個小朋友，每個小朋友可以分到幾顆？</w:t>
+        <w:t xml:space="preserve">13. </w:t>
+      </w:r>
+      <w:r>
+        <w:rPr>
+          <w:rFonts w:ascii="Microsoft JhengHei" w:hAnsi="Microsoft JhengHei"/>
+        </w:rPr>
+        <w:t>老師有12顆糖果，平分給4個小朋友，每個小朋友可以分到幾顆？</w:t>
       </w:r>
     </w:p>
     <w:p>
@@ -842,7 +1208,13 @@
         <w:rPr>
           <w:rFonts w:ascii="Microsoft JhengHei" w:hAnsi="Microsoft JhengHei"/>
         </w:rPr>
-        <w:t xml:space="preserve">   (A) 3顆</w:t>
+        <w:t xml:space="preserve">   (A) </w:t>
+      </w:r>
+      <w:r>
+        <w:rPr>
+          <w:rFonts w:ascii="Microsoft JhengHei" w:hAnsi="Microsoft JhengHei"/>
+        </w:rPr>
+        <w:t>3顆</w:t>
       </w:r>
     </w:p>
     <w:p>
@@ -854,7 +1226,13 @@
         <w:rPr>
           <w:rFonts w:ascii="Microsoft JhengHei" w:hAnsi="Microsoft JhengHei"/>
         </w:rPr>
-        <w:t xml:space="preserve">   (B) 4顆</w:t>
+        <w:t xml:space="preserve">   (B) </w:t>
+      </w:r>
+      <w:r>
+        <w:rPr>
+          <w:rFonts w:ascii="Microsoft JhengHei" w:hAnsi="Microsoft JhengHei"/>
+        </w:rPr>
+        <w:t>4顆</w:t>
       </w:r>
     </w:p>
     <w:p>
@@ -866,7 +1244,13 @@
         <w:rPr>
           <w:rFonts w:ascii="Microsoft JhengHei" w:hAnsi="Microsoft JhengHei"/>
         </w:rPr>
-        <w:t xml:space="preserve">   (C) 8顆</w:t>
+        <w:t xml:space="preserve">   (C) </w:t>
+      </w:r>
+      <w:r>
+        <w:rPr>
+          <w:rFonts w:ascii="Microsoft JhengHei" w:hAnsi="Microsoft JhengHei"/>
+        </w:rPr>
+        <w:t>8顆</w:t>
       </w:r>
     </w:p>
     <w:p>
@@ -878,7 +1262,13 @@
         <w:rPr>
           <w:rFonts w:ascii="Microsoft JhengHei" w:hAnsi="Microsoft JhengHei"/>
         </w:rPr>
-        <w:t xml:space="preserve">   (D) 16顆</w:t>
+        <w:t xml:space="preserve">   (D) </w:t>
+      </w:r>
+      <w:r>
+        <w:rPr>
+          <w:rFonts w:ascii="Microsoft JhengHei" w:hAnsi="Microsoft JhengHei"/>
+        </w:rPr>
+        <w:t>16顆</w:t>
       </w:r>
     </w:p>
     <w:p>
@@ -904,7 +1294,13 @@
         <w:rPr>
           <w:rFonts w:ascii="Microsoft JhengHei" w:hAnsi="Microsoft JhengHei"/>
         </w:rPr>
-        <w:t>14. 花園裡有25朵紅花、18朵黃花。黃花和紅花合起來，比白花多10朵。白花有幾朵？</w:t>
+        <w:t xml:space="preserve">14. </w:t>
+      </w:r>
+      <w:r>
+        <w:rPr>
+          <w:rFonts w:ascii="Microsoft JhengHei" w:hAnsi="Microsoft JhengHei"/>
+        </w:rPr>
+        <w:t>花園裡有25朵紅花、18朵黃花。黃花和紅花合起來，比白花多10朵。白花有幾朵？</w:t>
       </w:r>
     </w:p>
     <w:p>
@@ -916,7 +1312,13 @@
         <w:rPr>
           <w:rFonts w:ascii="Microsoft JhengHei" w:hAnsi="Microsoft JhengHei"/>
         </w:rPr>
-        <w:t xml:space="preserve">   (A) 23朵</w:t>
+        <w:t xml:space="preserve">   (A) </w:t>
+      </w:r>
+      <w:r>
+        <w:rPr>
+          <w:rFonts w:ascii="Microsoft JhengHei" w:hAnsi="Microsoft JhengHei"/>
+        </w:rPr>
+        <w:t>23朵</w:t>
       </w:r>
     </w:p>
     <w:p>
@@ -928,7 +1330,13 @@
         <w:rPr>
           <w:rFonts w:ascii="Microsoft JhengHei" w:hAnsi="Microsoft JhengHei"/>
         </w:rPr>
-        <w:t xml:space="preserve">   (B) 33朵</w:t>
+        <w:t xml:space="preserve">   (B) </w:t>
+      </w:r>
+      <w:r>
+        <w:rPr>
+          <w:rFonts w:ascii="Microsoft JhengHei" w:hAnsi="Microsoft JhengHei"/>
+        </w:rPr>
+        <w:t>33朵</w:t>
       </w:r>
     </w:p>
     <w:p>
@@ -940,7 +1348,13 @@
         <w:rPr>
           <w:rFonts w:ascii="Microsoft JhengHei" w:hAnsi="Microsoft JhengHei"/>
         </w:rPr>
-        <w:t xml:space="preserve">   (C) 43朵</w:t>
+        <w:t xml:space="preserve">   (C) </w:t>
+      </w:r>
+      <w:r>
+        <w:rPr>
+          <w:rFonts w:ascii="Microsoft JhengHei" w:hAnsi="Microsoft JhengHei"/>
+        </w:rPr>
+        <w:t>43朵</w:t>
       </w:r>
     </w:p>
     <w:p>
@@ -952,7 +1366,13 @@
         <w:rPr>
           <w:rFonts w:ascii="Microsoft JhengHei" w:hAnsi="Microsoft JhengHei"/>
         </w:rPr>
-        <w:t xml:space="preserve">   (D) 53朵</w:t>
+        <w:t xml:space="preserve">   (D) </w:t>
+      </w:r>
+      <w:r>
+        <w:rPr>
+          <w:rFonts w:ascii="Microsoft JhengHei" w:hAnsi="Microsoft JhengHei"/>
+        </w:rPr>
+        <w:t>53朵</w:t>
       </w:r>
     </w:p>
     <w:p>
@@ -964,7 +1384,13 @@
         <w:rPr>
           <w:rFonts w:ascii="Microsoft JhengHei" w:hAnsi="Microsoft JhengHei"/>
         </w:rPr>
-        <w:t>15. 小明有20元，買糖果花了5元，買玩具車花了8元，他還剩下幾元？</w:t>
+        <w:t xml:space="preserve">15. </w:t>
+      </w:r>
+      <w:r>
+        <w:rPr>
+          <w:rFonts w:ascii="Microsoft JhengHei" w:hAnsi="Microsoft JhengHei"/>
+        </w:rPr>
+        <w:t>小明有20元，買糖果花了5元，買玩具車花了8元，他還剩下幾元？</w:t>
       </w:r>
     </w:p>
     <w:p>
@@ -976,7 +1402,13 @@
         <w:rPr>
           <w:rFonts w:ascii="Microsoft JhengHei" w:hAnsi="Microsoft JhengHei"/>
         </w:rPr>
-        <w:t xml:space="preserve">   (A) 7元</w:t>
+        <w:t xml:space="preserve">   (A) </w:t>
+      </w:r>
+      <w:r>
+        <w:rPr>
+          <w:rFonts w:ascii="Microsoft JhengHei" w:hAnsi="Microsoft JhengHei"/>
+        </w:rPr>
+        <w:t>7元</w:t>
       </w:r>
     </w:p>
     <w:p>
@@ -988,7 +1420,13 @@
         <w:rPr>
           <w:rFonts w:ascii="Microsoft JhengHei" w:hAnsi="Microsoft JhengHei"/>
         </w:rPr>
-        <w:t xml:space="preserve">   (B) 12元</w:t>
+        <w:t xml:space="preserve">   (B) </w:t>
+      </w:r>
+      <w:r>
+        <w:rPr>
+          <w:rFonts w:ascii="Microsoft JhengHei" w:hAnsi="Microsoft JhengHei"/>
+        </w:rPr>
+        <w:t>12元</w:t>
       </w:r>
     </w:p>
     <w:p>
@@ -1000,7 +1438,13 @@
         <w:rPr>
           <w:rFonts w:ascii="Microsoft JhengHei" w:hAnsi="Microsoft JhengHei"/>
         </w:rPr>
-        <w:t xml:space="preserve">   (C) 13元</w:t>
+        <w:t xml:space="preserve">   (C) </w:t>
+      </w:r>
+      <w:r>
+        <w:rPr>
+          <w:rFonts w:ascii="Microsoft JhengHei" w:hAnsi="Microsoft JhengHei"/>
+        </w:rPr>
+        <w:t>13元</w:t>
       </w:r>
     </w:p>
     <w:p>
@@ -1012,7 +1456,13 @@
         <w:rPr>
           <w:rFonts w:ascii="Microsoft JhengHei" w:hAnsi="Microsoft JhengHei"/>
         </w:rPr>
-        <w:t xml:space="preserve">   (D) 15元</w:t>
+        <w:t xml:space="preserve">   (D) </w:t>
+      </w:r>
+      <w:r>
+        <w:rPr>
+          <w:rFonts w:ascii="Microsoft JhengHei" w:hAnsi="Microsoft JhengHei"/>
+        </w:rPr>
+        <w:t>15元</w:t>
       </w:r>
     </w:p>
     <w:p>
@@ -1024,7 +1474,13 @@
         <w:rPr>
           <w:rFonts w:ascii="Microsoft JhengHei" w:hAnsi="Microsoft JhengHei"/>
         </w:rPr>
-        <w:t>16. 小美原本有32張貼紙，分給弟弟10張後，爸爸又給她15張，現在小美一共有幾張貼紙？</w:t>
+        <w:t xml:space="preserve">16. </w:t>
+      </w:r>
+      <w:r>
+        <w:rPr>
+          <w:rFonts w:ascii="Microsoft JhengHei" w:hAnsi="Microsoft JhengHei"/>
+        </w:rPr>
+        <w:t>小美原本有32張貼紙，分給弟弟10張後，爸爸又給她15張，現在小美一共有幾張貼紙？</w:t>
       </w:r>
     </w:p>
     <w:p>
@@ -1036,7 +1492,13 @@
         <w:rPr>
           <w:rFonts w:ascii="Microsoft JhengHei" w:hAnsi="Microsoft JhengHei"/>
         </w:rPr>
-        <w:t xml:space="preserve">   (A) 22張</w:t>
+        <w:t xml:space="preserve">   (A) </w:t>
+      </w:r>
+      <w:r>
+        <w:rPr>
+          <w:rFonts w:ascii="Microsoft JhengHei" w:hAnsi="Microsoft JhengHei"/>
+        </w:rPr>
+        <w:t>22張</w:t>
       </w:r>
     </w:p>
     <w:p>
@@ -1048,7 +1510,13 @@
         <w:rPr>
           <w:rFonts w:ascii="Microsoft JhengHei" w:hAnsi="Microsoft JhengHei"/>
         </w:rPr>
-        <w:t xml:space="preserve">   (B) 27張</w:t>
+        <w:t xml:space="preserve">   (B) </w:t>
+      </w:r>
+      <w:r>
+        <w:rPr>
+          <w:rFonts w:ascii="Microsoft JhengHei" w:hAnsi="Microsoft JhengHei"/>
+        </w:rPr>
+        <w:t>27張</w:t>
       </w:r>
     </w:p>
     <w:p>
@@ -1060,7 +1528,13 @@
         <w:rPr>
           <w:rFonts w:ascii="Microsoft JhengHei" w:hAnsi="Microsoft JhengHei"/>
         </w:rPr>
-        <w:t xml:space="preserve">   (C) 37張</w:t>
+        <w:t xml:space="preserve">   (C) </w:t>
+      </w:r>
+      <w:r>
+        <w:rPr>
+          <w:rFonts w:ascii="Microsoft JhengHei" w:hAnsi="Microsoft JhengHei"/>
+        </w:rPr>
+        <w:t>37張</w:t>
       </w:r>
     </w:p>
     <w:p>
@@ -1072,7 +1546,13 @@
         <w:rPr>
           <w:rFonts w:ascii="Microsoft JhengHei" w:hAnsi="Microsoft JhengHei"/>
         </w:rPr>
-        <w:t xml:space="preserve">   (D) 47張</w:t>
+        <w:t xml:space="preserve">   (D) </w:t>
+      </w:r>
+      <w:r>
+        <w:rPr>
+          <w:rFonts w:ascii="Microsoft JhengHei" w:hAnsi="Microsoft JhengHei"/>
+        </w:rPr>
+        <w:t>47張</w:t>
       </w:r>
     </w:p>
     <w:p>
@@ -1084,7 +1564,13 @@
         <w:rPr>
           <w:rFonts w:ascii="Microsoft JhengHei" w:hAnsi="Microsoft JhengHei"/>
         </w:rPr>
-        <w:t>17. 媽媽買了3袋蘋果，每袋有4個，爸爸又買了5個散裝的蘋果，現在一共有幾個蘋果？</w:t>
+        <w:t xml:space="preserve">17. </w:t>
+      </w:r>
+      <w:r>
+        <w:rPr>
+          <w:rFonts w:ascii="Microsoft JhengHei" w:hAnsi="Microsoft JhengHei"/>
+        </w:rPr>
+        <w:t>媽媽買了3袋蘋果，每袋有4個，爸爸又買了5個散裝的蘋果，現在一共有幾個蘋果？</w:t>
       </w:r>
     </w:p>
     <w:p>
@@ -1096,7 +1582,13 @@
         <w:rPr>
           <w:rFonts w:ascii="Microsoft JhengHei" w:hAnsi="Microsoft JhengHei"/>
         </w:rPr>
-        <w:t xml:space="preserve">   (A) 12個</w:t>
+        <w:t xml:space="preserve">   (A) </w:t>
+      </w:r>
+      <w:r>
+        <w:rPr>
+          <w:rFonts w:ascii="Microsoft JhengHei" w:hAnsi="Microsoft JhengHei"/>
+        </w:rPr>
+        <w:t>12個</w:t>
       </w:r>
     </w:p>
     <w:p>
@@ -1108,7 +1600,13 @@
         <w:rPr>
           <w:rFonts w:ascii="Microsoft JhengHei" w:hAnsi="Microsoft JhengHei"/>
         </w:rPr>
-        <w:t xml:space="preserve">   (B) 15個</w:t>
+        <w:t xml:space="preserve">   (B) </w:t>
+      </w:r>
+      <w:r>
+        <w:rPr>
+          <w:rFonts w:ascii="Microsoft JhengHei" w:hAnsi="Microsoft JhengHei"/>
+        </w:rPr>
+        <w:t>15個</w:t>
       </w:r>
     </w:p>
     <w:p>
@@ -1120,7 +1618,13 @@
         <w:rPr>
           <w:rFonts w:ascii="Microsoft JhengHei" w:hAnsi="Microsoft JhengHei"/>
         </w:rPr>
-        <w:t xml:space="preserve">   (C) 17個</w:t>
+        <w:t xml:space="preserve">   (C) </w:t>
+      </w:r>
+      <w:r>
+        <w:rPr>
+          <w:rFonts w:ascii="Microsoft JhengHei" w:hAnsi="Microsoft JhengHei"/>
+        </w:rPr>
+        <w:t>17個</w:t>
       </w:r>
     </w:p>
     <w:p>
@@ -1132,7 +1636,13 @@
         <w:rPr>
           <w:rFonts w:ascii="Microsoft JhengHei" w:hAnsi="Microsoft JhengHei"/>
         </w:rPr>
-        <w:t xml:space="preserve">   (D) 27個</w:t>
+        <w:t xml:space="preserve">   (D) </w:t>
+      </w:r>
+      <w:r>
+        <w:rPr>
+          <w:rFonts w:ascii="Microsoft JhengHei" w:hAnsi="Microsoft JhengHei"/>
+        </w:rPr>
+        <w:t>27個</w:t>
       </w:r>
     </w:p>
     <w:p>
@@ -1172,7 +1682,13 @@
         <w:rPr>
           <w:rFonts w:ascii="Microsoft JhengHei" w:hAnsi="Microsoft JhengHei"/>
         </w:rPr>
-        <w:t>18. 什麼是「三分之一」？</w:t>
+        <w:t xml:space="preserve">18. </w:t>
+      </w:r>
+      <w:r>
+        <w:rPr>
+          <w:rFonts w:ascii="Microsoft JhengHei" w:hAnsi="Microsoft JhengHei"/>
+        </w:rPr>
+        <w:t>什麼是「三分之一」？</w:t>
       </w:r>
     </w:p>
     <w:p>
@@ -1184,7 +1700,13 @@
         <w:rPr>
           <w:rFonts w:ascii="Microsoft JhengHei" w:hAnsi="Microsoft JhengHei"/>
         </w:rPr>
-        <w:t xml:space="preserve">   (A) 把一個完整的物體分成3份，不一定要一樣大</w:t>
+        <w:t xml:space="preserve">   (A) </w:t>
+      </w:r>
+      <w:r>
+        <w:rPr>
+          <w:rFonts w:ascii="Microsoft JhengHei" w:hAnsi="Microsoft JhengHei"/>
+        </w:rPr>
+        <w:t>把一個完整的物體分成3份，不一定要一樣大</w:t>
       </w:r>
     </w:p>
     <w:p>
@@ -1196,7 +1718,13 @@
         <w:rPr>
           <w:rFonts w:ascii="Microsoft JhengHei" w:hAnsi="Microsoft JhengHei"/>
         </w:rPr>
-        <w:t xml:space="preserve">   (B) 有3個完整的物體，拿出其中的1個</w:t>
+        <w:t xml:space="preserve">   (B) </w:t>
+      </w:r>
+      <w:r>
+        <w:rPr>
+          <w:rFonts w:ascii="Microsoft JhengHei" w:hAnsi="Microsoft JhengHei"/>
+        </w:rPr>
+        <w:t>有3個完整的物體，拿出其中的1個</w:t>
       </w:r>
     </w:p>
     <w:p>
@@ -1208,7 +1736,13 @@
         <w:rPr>
           <w:rFonts w:ascii="Microsoft JhengHei" w:hAnsi="Microsoft JhengHei"/>
         </w:rPr>
-        <w:t xml:space="preserve">   (C) 把一個完整的物體平分成3份，其中的1份</w:t>
+        <w:t xml:space="preserve">   (C) </w:t>
+      </w:r>
+      <w:r>
+        <w:rPr>
+          <w:rFonts w:ascii="Microsoft JhengHei" w:hAnsi="Microsoft JhengHei"/>
+        </w:rPr>
+        <w:t>把一個完整的物體平分成3份，其中的1份</w:t>
       </w:r>
     </w:p>
     <w:p>
@@ -1220,7 +1754,13 @@
         <w:rPr>
           <w:rFonts w:ascii="Microsoft JhengHei" w:hAnsi="Microsoft JhengHei"/>
         </w:rPr>
-        <w:t xml:space="preserve">   (D) 把一個完整的物體平分成3份，其中的2份</w:t>
+        <w:t xml:space="preserve">   (D) </w:t>
+      </w:r>
+      <w:r>
+        <w:rPr>
+          <w:rFonts w:ascii="Microsoft JhengHei" w:hAnsi="Microsoft JhengHei"/>
+        </w:rPr>
+        <w:t>把一個完整的物體平分成3份，其中的2份</w:t>
       </w:r>
     </w:p>
     <w:p>
@@ -1232,7 +1772,59 @@
         <w:rPr>
           <w:rFonts w:ascii="Microsoft JhengHei" w:hAnsi="Microsoft JhengHei"/>
         </w:rPr>
-        <w:t>19. 比大小：四分之一（1/4）個蛋糕和六分之一（1/6）個蛋糕，哪一個比較大？</w:t>
+        <w:t xml:space="preserve">19. </w:t>
+      </w:r>
+      <w:r>
+        <w:rPr>
+          <w:rFonts w:ascii="Microsoft JhengHei" w:hAnsi="Microsoft JhengHei"/>
+        </w:rPr>
+        <w:t>比大小：四分之一（</w:t>
+      </w:r>
+      <m:oMath>
+        <m:f>
+          <m:fPr>
+            <m:type m:val="bar"/>
+          </m:fPr>
+          <m:num>
+            <m:r>
+              <m:t>1</m:t>
+            </m:r>
+          </m:num>
+          <m:den>
+            <m:r>
+              <m:t>4</m:t>
+            </m:r>
+          </m:den>
+        </m:f>
+      </m:oMath>
+      <w:r>
+        <w:rPr>
+          <w:rFonts w:ascii="Microsoft JhengHei" w:hAnsi="Microsoft JhengHei"/>
+        </w:rPr>
+        <w:t>）個蛋糕和六分之一（</w:t>
+      </w:r>
+      <m:oMath>
+        <m:f>
+          <m:fPr>
+            <m:type m:val="bar"/>
+          </m:fPr>
+          <m:num>
+            <m:r>
+              <m:t>1</m:t>
+            </m:r>
+          </m:num>
+          <m:den>
+            <m:r>
+              <m:t>6</m:t>
+            </m:r>
+          </m:den>
+        </m:f>
+      </m:oMath>
+      <w:r>
+        <w:rPr>
+          <w:rFonts w:ascii="Microsoft JhengHei" w:hAnsi="Microsoft JhengHei"/>
+        </w:rPr>
+        <w:t>）個蛋糕，哪一個比較大？</w:t>
       </w:r>
     </w:p>
     <w:p>
@@ -1244,7 +1836,36 @@
         <w:rPr>
           <w:rFonts w:ascii="Microsoft JhengHei" w:hAnsi="Microsoft JhengHei"/>
         </w:rPr>
-        <w:t xml:space="preserve">   (A) 四分之一（1/4）個蛋糕比較大</w:t>
+        <w:t xml:space="preserve">   (A) </w:t>
+      </w:r>
+      <w:r>
+        <w:rPr>
+          <w:rFonts w:ascii="Microsoft JhengHei" w:hAnsi="Microsoft JhengHei"/>
+        </w:rPr>
+        <w:t>四分之一（</w:t>
+      </w:r>
+      <m:oMath>
+        <m:f>
+          <m:fPr>
+            <m:type m:val="bar"/>
+          </m:fPr>
+          <m:num>
+            <m:r>
+              <m:t>1</m:t>
+            </m:r>
+          </m:num>
+          <m:den>
+            <m:r>
+              <m:t>4</m:t>
+            </m:r>
+          </m:den>
+        </m:f>
+      </m:oMath>
+      <w:r>
+        <w:rPr>
+          <w:rFonts w:ascii="Microsoft JhengHei" w:hAnsi="Microsoft JhengHei"/>
+        </w:rPr>
+        <w:t>）個蛋糕比較大</w:t>
       </w:r>
     </w:p>
     <w:p>
@@ -1256,7 +1877,36 @@
         <w:rPr>
           <w:rFonts w:ascii="Microsoft JhengHei" w:hAnsi="Microsoft JhengHei"/>
         </w:rPr>
-        <w:t xml:space="preserve">   (B) 六分之一（1/6）個蛋糕比較大</w:t>
+        <w:t xml:space="preserve">   (B) </w:t>
+      </w:r>
+      <w:r>
+        <w:rPr>
+          <w:rFonts w:ascii="Microsoft JhengHei" w:hAnsi="Microsoft JhengHei"/>
+        </w:rPr>
+        <w:t>六分之一（</w:t>
+      </w:r>
+      <m:oMath>
+        <m:f>
+          <m:fPr>
+            <m:type m:val="bar"/>
+          </m:fPr>
+          <m:num>
+            <m:r>
+              <m:t>1</m:t>
+            </m:r>
+          </m:num>
+          <m:den>
+            <m:r>
+              <m:t>6</m:t>
+            </m:r>
+          </m:den>
+        </m:f>
+      </m:oMath>
+      <w:r>
+        <w:rPr>
+          <w:rFonts w:ascii="Microsoft JhengHei" w:hAnsi="Microsoft JhengHei"/>
+        </w:rPr>
+        <w:t>）個蛋糕比較大</w:t>
       </w:r>
     </w:p>
     <w:p>
@@ -1268,7 +1918,13 @@
         <w:rPr>
           <w:rFonts w:ascii="Microsoft JhengHei" w:hAnsi="Microsoft JhengHei"/>
         </w:rPr>
-        <w:t xml:space="preserve">   (C) 兩者一樣大</w:t>
+        <w:t xml:space="preserve">   (C) </w:t>
+      </w:r>
+      <w:r>
+        <w:rPr>
+          <w:rFonts w:ascii="Microsoft JhengHei" w:hAnsi="Microsoft JhengHei"/>
+        </w:rPr>
+        <w:t>兩者一樣大</w:t>
       </w:r>
     </w:p>
     <w:p>
@@ -1280,7 +1936,13 @@
         <w:rPr>
           <w:rFonts w:ascii="Microsoft JhengHei" w:hAnsi="Microsoft JhengHei"/>
         </w:rPr>
-        <w:t xml:space="preserve">   (D) 無法比較大小</w:t>
+        <w:t xml:space="preserve">   (D) </w:t>
+      </w:r>
+      <w:r>
+        <w:rPr>
+          <w:rFonts w:ascii="Microsoft JhengHei" w:hAnsi="Microsoft JhengHei"/>
+        </w:rPr>
+        <w:t>無法比較大小</w:t>
       </w:r>
     </w:p>
     <w:p>
@@ -1292,7 +1954,13 @@
         <w:rPr>
           <w:rFonts w:ascii="Microsoft JhengHei" w:hAnsi="Microsoft JhengHei"/>
         </w:rPr>
-        <w:t>20. 媽媽把一個圓形大披薩平分成8份，哥哥吃了其中1份，哥哥吃了幾個披薩？</w:t>
+        <w:t xml:space="preserve">20. </w:t>
+      </w:r>
+      <w:r>
+        <w:rPr>
+          <w:rFonts w:ascii="Microsoft JhengHei" w:hAnsi="Microsoft JhengHei"/>
+        </w:rPr>
+        <w:t>媽媽把一個圓形大披薩平分成8份，哥哥吃了其中1份，哥哥吃了幾個披薩？</w:t>
       </w:r>
     </w:p>
     <w:p>
@@ -1304,7 +1972,13 @@
         <w:rPr>
           <w:rFonts w:ascii="Microsoft JhengHei" w:hAnsi="Microsoft JhengHei"/>
         </w:rPr>
-        <w:t xml:space="preserve">   (A) 1/8個</w:t>
+        <w:t xml:space="preserve">   (A) </w:t>
+      </w:r>
+      <w:r>
+        <w:rPr>
+          <w:rFonts w:ascii="Microsoft JhengHei" w:hAnsi="Microsoft JhengHei"/>
+        </w:rPr>
+        <w:t>1/8個</w:t>
       </w:r>
     </w:p>
     <w:p>
@@ -1316,7 +1990,13 @@
         <w:rPr>
           <w:rFonts w:ascii="Microsoft JhengHei" w:hAnsi="Microsoft JhengHei"/>
         </w:rPr>
-        <w:t xml:space="preserve">   (B) 7/8個</w:t>
+        <w:t xml:space="preserve">   (B) </w:t>
+      </w:r>
+      <w:r>
+        <w:rPr>
+          <w:rFonts w:ascii="Microsoft JhengHei" w:hAnsi="Microsoft JhengHei"/>
+        </w:rPr>
+        <w:t>7/8個</w:t>
       </w:r>
     </w:p>
     <w:p>
@@ -1328,7 +2008,13 @@
         <w:rPr>
           <w:rFonts w:ascii="Microsoft JhengHei" w:hAnsi="Microsoft JhengHei"/>
         </w:rPr>
-        <w:t xml:space="preserve">   (C) 1個</w:t>
+        <w:t xml:space="preserve">   (C) </w:t>
+      </w:r>
+      <w:r>
+        <w:rPr>
+          <w:rFonts w:ascii="Microsoft JhengHei" w:hAnsi="Microsoft JhengHei"/>
+        </w:rPr>
+        <w:t>1個</w:t>
       </w:r>
     </w:p>
     <w:p>
@@ -1340,7 +2026,13 @@
         <w:rPr>
           <w:rFonts w:ascii="Microsoft JhengHei" w:hAnsi="Microsoft JhengHei"/>
         </w:rPr>
-        <w:t xml:space="preserve">   (D) 8個</w:t>
+        <w:t xml:space="preserve">   (D) </w:t>
+      </w:r>
+      <w:r>
+        <w:rPr>
+          <w:rFonts w:ascii="Microsoft JhengHei" w:hAnsi="Microsoft JhengHei"/>
+        </w:rPr>
+        <w:t>8個</w:t>
       </w:r>
     </w:p>
     <w:p>
@@ -1352,7 +2044,13 @@
         <w:rPr>
           <w:rFonts w:ascii="Microsoft JhengHei" w:hAnsi="Microsoft JhengHei"/>
         </w:rPr>
-        <w:t>21. 一條長1公尺的繩子，平分成5段，其中的1段是多少條繩子？</w:t>
+        <w:t xml:space="preserve">21. </w:t>
+      </w:r>
+      <w:r>
+        <w:rPr>
+          <w:rFonts w:ascii="Microsoft JhengHei" w:hAnsi="Microsoft JhengHei"/>
+        </w:rPr>
+        <w:t>一條長1公尺的繩子，平分成5段，其中的1段是多少條繩子？</w:t>
       </w:r>
     </w:p>
     <w:p>
@@ -1364,7 +2062,36 @@
         <w:rPr>
           <w:rFonts w:ascii="Microsoft JhengHei" w:hAnsi="Microsoft JhengHei"/>
         </w:rPr>
-        <w:t xml:space="preserve">   (A) 五分之一（1/5）條</w:t>
+        <w:t xml:space="preserve">   (A) </w:t>
+      </w:r>
+      <w:r>
+        <w:rPr>
+          <w:rFonts w:ascii="Microsoft JhengHei" w:hAnsi="Microsoft JhengHei"/>
+        </w:rPr>
+        <w:t>五分之一（</w:t>
+      </w:r>
+      <m:oMath>
+        <m:f>
+          <m:fPr>
+            <m:type m:val="bar"/>
+          </m:fPr>
+          <m:num>
+            <m:r>
+              <m:t>1</m:t>
+            </m:r>
+          </m:num>
+          <m:den>
+            <m:r>
+              <m:t>5</m:t>
+            </m:r>
+          </m:den>
+        </m:f>
+      </m:oMath>
+      <w:r>
+        <w:rPr>
+          <w:rFonts w:ascii="Microsoft JhengHei" w:hAnsi="Microsoft JhengHei"/>
+        </w:rPr>
+        <w:t>）條</w:t>
       </w:r>
     </w:p>
     <w:p>
@@ -1376,7 +2103,36 @@
         <w:rPr>
           <w:rFonts w:ascii="Microsoft JhengHei" w:hAnsi="Microsoft JhengHei"/>
         </w:rPr>
-        <w:t xml:space="preserve">   (B) 五分之二（2/5）條</w:t>
+        <w:t xml:space="preserve">   (B) </w:t>
+      </w:r>
+      <w:r>
+        <w:rPr>
+          <w:rFonts w:ascii="Microsoft JhengHei" w:hAnsi="Microsoft JhengHei"/>
+        </w:rPr>
+        <w:t>五分之二（</w:t>
+      </w:r>
+      <m:oMath>
+        <m:f>
+          <m:fPr>
+            <m:type m:val="bar"/>
+          </m:fPr>
+          <m:num>
+            <m:r>
+              <m:t>2</m:t>
+            </m:r>
+          </m:num>
+          <m:den>
+            <m:r>
+              <m:t>5</m:t>
+            </m:r>
+          </m:den>
+        </m:f>
+      </m:oMath>
+      <w:r>
+        <w:rPr>
+          <w:rFonts w:ascii="Microsoft JhengHei" w:hAnsi="Microsoft JhengHei"/>
+        </w:rPr>
+        <w:t>）條</w:t>
       </w:r>
     </w:p>
     <w:p>
@@ -1388,7 +2144,36 @@
         <w:rPr>
           <w:rFonts w:ascii="Microsoft JhengHei" w:hAnsi="Microsoft JhengHei"/>
         </w:rPr>
-        <w:t xml:space="preserve">   (C) 二分之五（5/2）條</w:t>
+        <w:t xml:space="preserve">   (C) </w:t>
+      </w:r>
+      <w:r>
+        <w:rPr>
+          <w:rFonts w:ascii="Microsoft JhengHei" w:hAnsi="Microsoft JhengHei"/>
+        </w:rPr>
+        <w:t>二分之五（</w:t>
+      </w:r>
+      <m:oMath>
+        <m:f>
+          <m:fPr>
+            <m:type m:val="bar"/>
+          </m:fPr>
+          <m:num>
+            <m:r>
+              <m:t>5</m:t>
+            </m:r>
+          </m:num>
+          <m:den>
+            <m:r>
+              <m:t>2</m:t>
+            </m:r>
+          </m:den>
+        </m:f>
+      </m:oMath>
+      <w:r>
+        <w:rPr>
+          <w:rFonts w:ascii="Microsoft JhengHei" w:hAnsi="Microsoft JhengHei"/>
+        </w:rPr>
+        <w:t>）條</w:t>
       </w:r>
     </w:p>
     <w:p>
@@ -1400,7 +2185,13 @@
         <w:rPr>
           <w:rFonts w:ascii="Microsoft JhengHei" w:hAnsi="Microsoft JhengHei"/>
         </w:rPr>
-        <w:t xml:space="preserve">   (D) 5條</w:t>
+        <w:t xml:space="preserve">   (D) </w:t>
+      </w:r>
+      <w:r>
+        <w:rPr>
+          <w:rFonts w:ascii="Microsoft JhengHei" w:hAnsi="Microsoft JhengHei"/>
+        </w:rPr>
+        <w:t>5條</w:t>
       </w:r>
     </w:p>
     <w:p>
@@ -1426,7 +2217,13 @@
         <w:rPr>
           <w:rFonts w:ascii="Microsoft JhengHei" w:hAnsi="Microsoft JhengHei"/>
         </w:rPr>
-        <w:t>22. 一條繩子原本長1公尺，剪掉30公分後，還剩下多少公分？</w:t>
+        <w:t xml:space="preserve">22. </w:t>
+      </w:r>
+      <w:r>
+        <w:rPr>
+          <w:rFonts w:ascii="Microsoft JhengHei" w:hAnsi="Microsoft JhengHei"/>
+        </w:rPr>
+        <w:t>一條繩子原本長1公尺，剪掉30公分後，還剩下多少公分？</w:t>
       </w:r>
     </w:p>
     <w:p>
@@ -1438,7 +2235,13 @@
         <w:rPr>
           <w:rFonts w:ascii="Microsoft JhengHei" w:hAnsi="Microsoft JhengHei"/>
         </w:rPr>
-        <w:t xml:space="preserve">   (A) 60公分</w:t>
+        <w:t xml:space="preserve">   (A) </w:t>
+      </w:r>
+      <w:r>
+        <w:rPr>
+          <w:rFonts w:ascii="Microsoft JhengHei" w:hAnsi="Microsoft JhengHei"/>
+        </w:rPr>
+        <w:t>60公分</w:t>
       </w:r>
     </w:p>
     <w:p>
@@ -1450,7 +2253,13 @@
         <w:rPr>
           <w:rFonts w:ascii="Microsoft JhengHei" w:hAnsi="Microsoft JhengHei"/>
         </w:rPr>
-        <w:t xml:space="preserve">   (B) 70公分</w:t>
+        <w:t xml:space="preserve">   (B) </w:t>
+      </w:r>
+      <w:r>
+        <w:rPr>
+          <w:rFonts w:ascii="Microsoft JhengHei" w:hAnsi="Microsoft JhengHei"/>
+        </w:rPr>
+        <w:t>70公分</w:t>
       </w:r>
     </w:p>
     <w:p>
@@ -1462,7 +2271,13 @@
         <w:rPr>
           <w:rFonts w:ascii="Microsoft JhengHei" w:hAnsi="Microsoft JhengHei"/>
         </w:rPr>
-        <w:t xml:space="preserve">   (C) 130公分</w:t>
+        <w:t xml:space="preserve">   (C) </w:t>
+      </w:r>
+      <w:r>
+        <w:rPr>
+          <w:rFonts w:ascii="Microsoft JhengHei" w:hAnsi="Microsoft JhengHei"/>
+        </w:rPr>
+        <w:t>130公分</w:t>
       </w:r>
     </w:p>
     <w:p>
@@ -1474,7 +2289,13 @@
         <w:rPr>
           <w:rFonts w:ascii="Microsoft JhengHei" w:hAnsi="Microsoft JhengHei"/>
         </w:rPr>
-        <w:t xml:space="preserve">   (D) 700公分</w:t>
+        <w:t xml:space="preserve">   (D) </w:t>
+      </w:r>
+      <w:r>
+        <w:rPr>
+          <w:rFonts w:ascii="Microsoft JhengHei" w:hAnsi="Microsoft JhengHei"/>
+        </w:rPr>
+        <w:t>700公分</w:t>
       </w:r>
     </w:p>
     <w:p>
@@ -1486,7 +2307,13 @@
         <w:rPr>
           <w:rFonts w:ascii="Microsoft JhengHei" w:hAnsi="Microsoft JhengHei"/>
         </w:rPr>
-        <w:t>23. 教室黑板的長度大約是4（），一枝彩虹筆的長度大約是15（）。括號中依序應填入什麼長度單位？</w:t>
+        <w:t xml:space="preserve">23. </w:t>
+      </w:r>
+      <w:r>
+        <w:rPr>
+          <w:rFonts w:ascii="Microsoft JhengHei" w:hAnsi="Microsoft JhengHei"/>
+        </w:rPr>
+        <w:t>教室黑板的長度大約是4（），一枝彩虹筆的長度大約是15（）。括號中依序應填入什麼長度單位？</w:t>
       </w:r>
     </w:p>
     <w:p>
@@ -1498,7 +2325,13 @@
         <w:rPr>
           <w:rFonts w:ascii="Microsoft JhengHei" w:hAnsi="Microsoft JhengHei"/>
         </w:rPr>
-        <w:t xml:space="preserve">   (A) 公尺；公分</w:t>
+        <w:t xml:space="preserve">   (A) </w:t>
+      </w:r>
+      <w:r>
+        <w:rPr>
+          <w:rFonts w:ascii="Microsoft JhengHei" w:hAnsi="Microsoft JhengHei"/>
+        </w:rPr>
+        <w:t>公尺；公分</w:t>
       </w:r>
     </w:p>
     <w:p>
@@ -1510,7 +2343,13 @@
         <w:rPr>
           <w:rFonts w:ascii="Microsoft JhengHei" w:hAnsi="Microsoft JhengHei"/>
         </w:rPr>
-        <w:t xml:space="preserve">   (B) 公分；公尺</w:t>
+        <w:t xml:space="preserve">   (B) </w:t>
+      </w:r>
+      <w:r>
+        <w:rPr>
+          <w:rFonts w:ascii="Microsoft JhengHei" w:hAnsi="Microsoft JhengHei"/>
+        </w:rPr>
+        <w:t>公分；公尺</w:t>
       </w:r>
     </w:p>
     <w:p>
@@ -1522,7 +2361,13 @@
         <w:rPr>
           <w:rFonts w:ascii="Microsoft JhengHei" w:hAnsi="Microsoft JhengHei"/>
         </w:rPr>
-        <w:t xml:space="preserve">   (C) 公尺；公尺</w:t>
+        <w:t xml:space="preserve">   (C) </w:t>
+      </w:r>
+      <w:r>
+        <w:rPr>
+          <w:rFonts w:ascii="Microsoft JhengHei" w:hAnsi="Microsoft JhengHei"/>
+        </w:rPr>
+        <w:t>公尺；公尺</w:t>
       </w:r>
     </w:p>
     <w:p>
@@ -1534,7 +2379,13 @@
         <w:rPr>
           <w:rFonts w:ascii="Microsoft JhengHei" w:hAnsi="Microsoft JhengHei"/>
         </w:rPr>
-        <w:t xml:space="preserve">   (D) 公分；公分</w:t>
+        <w:t xml:space="preserve">   (D) </w:t>
+      </w:r>
+      <w:r>
+        <w:rPr>
+          <w:rFonts w:ascii="Microsoft JhengHei" w:hAnsi="Microsoft JhengHei"/>
+        </w:rPr>
+        <w:t>公分；公分</w:t>
       </w:r>
     </w:p>
     <w:p>
@@ -1546,7 +2397,13 @@
         <w:rPr>
           <w:rFonts w:ascii="Microsoft JhengHei" w:hAnsi="Microsoft JhengHei"/>
         </w:rPr>
-        <w:t>24. 一條藍色緞帶長50公分，一條綠色緞帶長40公分，兩條緞帶接在一起（不重疊）長幾公分？</w:t>
+        <w:t xml:space="preserve">24. </w:t>
+      </w:r>
+      <w:r>
+        <w:rPr>
+          <w:rFonts w:ascii="Microsoft JhengHei" w:hAnsi="Microsoft JhengHei"/>
+        </w:rPr>
+        <w:t>一條藍色緞帶長50公分，一條綠色緞帶長40公分，兩條緞帶接在一起（不重疊）長幾公分？</w:t>
       </w:r>
     </w:p>
     <w:p>
@@ -1558,7 +2415,13 @@
         <w:rPr>
           <w:rFonts w:ascii="Microsoft JhengHei" w:hAnsi="Microsoft JhengHei"/>
         </w:rPr>
-        <w:t xml:space="preserve">   (A) 10公分</w:t>
+        <w:t xml:space="preserve">   (A) </w:t>
+      </w:r>
+      <w:r>
+        <w:rPr>
+          <w:rFonts w:ascii="Microsoft JhengHei" w:hAnsi="Microsoft JhengHei"/>
+        </w:rPr>
+        <w:t>10公分</w:t>
       </w:r>
     </w:p>
     <w:p>
@@ -1570,7 +2433,13 @@
         <w:rPr>
           <w:rFonts w:ascii="Microsoft JhengHei" w:hAnsi="Microsoft JhengHei"/>
         </w:rPr>
-        <w:t xml:space="preserve">   (B) 80公分</w:t>
+        <w:t xml:space="preserve">   (B) </w:t>
+      </w:r>
+      <w:r>
+        <w:rPr>
+          <w:rFonts w:ascii="Microsoft JhengHei" w:hAnsi="Microsoft JhengHei"/>
+        </w:rPr>
+        <w:t>80公分</w:t>
       </w:r>
     </w:p>
     <w:p>
@@ -1582,7 +2451,13 @@
         <w:rPr>
           <w:rFonts w:ascii="Microsoft JhengHei" w:hAnsi="Microsoft JhengHei"/>
         </w:rPr>
-        <w:t xml:space="preserve">   (C) 90公分</w:t>
+        <w:t xml:space="preserve">   (C) </w:t>
+      </w:r>
+      <w:r>
+        <w:rPr>
+          <w:rFonts w:ascii="Microsoft JhengHei" w:hAnsi="Microsoft JhengHei"/>
+        </w:rPr>
+        <w:t>90公分</w:t>
       </w:r>
     </w:p>
     <w:p>
@@ -1594,7 +2469,13 @@
         <w:rPr>
           <w:rFonts w:ascii="Microsoft JhengHei" w:hAnsi="Microsoft JhengHei"/>
         </w:rPr>
-        <w:t xml:space="preserve">   (D) 100公分</w:t>
+        <w:t xml:space="preserve">   (D) </w:t>
+      </w:r>
+      <w:r>
+        <w:rPr>
+          <w:rFonts w:ascii="Microsoft JhengHei" w:hAnsi="Microsoft JhengHei"/>
+        </w:rPr>
+        <w:t>100公分</w:t>
       </w:r>
     </w:p>
     <w:p>
@@ -1606,7 +2487,13 @@
         <w:rPr>
           <w:rFonts w:ascii="Microsoft JhengHei" w:hAnsi="Microsoft JhengHei"/>
         </w:rPr>
-        <w:t>25. 小明用一把30公分的直尺量紅線，剛好量了2次才量完，這條紅線長幾公分？</w:t>
+        <w:t xml:space="preserve">25. </w:t>
+      </w:r>
+      <w:r>
+        <w:rPr>
+          <w:rFonts w:ascii="Microsoft JhengHei" w:hAnsi="Microsoft JhengHei"/>
+        </w:rPr>
+        <w:t>小明用一把30公分的直尺量紅線，剛好量了2次才量完，這條紅線長幾公分？</w:t>
       </w:r>
     </w:p>
     <w:p>
@@ -1618,7 +2505,13 @@
         <w:rPr>
           <w:rFonts w:ascii="Microsoft JhengHei" w:hAnsi="Microsoft JhengHei"/>
         </w:rPr>
-        <w:t xml:space="preserve">   (A) 30公分</w:t>
+        <w:t xml:space="preserve">   (A) </w:t>
+      </w:r>
+      <w:r>
+        <w:rPr>
+          <w:rFonts w:ascii="Microsoft JhengHei" w:hAnsi="Microsoft JhengHei"/>
+        </w:rPr>
+        <w:t>30公分</w:t>
       </w:r>
     </w:p>
     <w:p>
@@ -1630,7 +2523,13 @@
         <w:rPr>
           <w:rFonts w:ascii="Microsoft JhengHei" w:hAnsi="Microsoft JhengHei"/>
         </w:rPr>
-        <w:t xml:space="preserve">   (B) 32公分</w:t>
+        <w:t xml:space="preserve">   (B) </w:t>
+      </w:r>
+      <w:r>
+        <w:rPr>
+          <w:rFonts w:ascii="Microsoft JhengHei" w:hAnsi="Microsoft JhengHei"/>
+        </w:rPr>
+        <w:t>32公分</w:t>
       </w:r>
     </w:p>
     <w:p>
@@ -1642,7 +2541,13 @@
         <w:rPr>
           <w:rFonts w:ascii="Microsoft JhengHei" w:hAnsi="Microsoft JhengHei"/>
         </w:rPr>
-        <w:t xml:space="preserve">   (C) 60公分</w:t>
+        <w:t xml:space="preserve">   (C) </w:t>
+      </w:r>
+      <w:r>
+        <w:rPr>
+          <w:rFonts w:ascii="Microsoft JhengHei" w:hAnsi="Microsoft JhengHei"/>
+        </w:rPr>
+        <w:t>60公分</w:t>
       </w:r>
     </w:p>
     <w:p>
@@ -1654,7 +2559,13 @@
         <w:rPr>
           <w:rFonts w:ascii="Microsoft JhengHei" w:hAnsi="Microsoft JhengHei"/>
         </w:rPr>
-        <w:t xml:space="preserve">   (D) 90公分</w:t>
+        <w:t xml:space="preserve">   (D) </w:t>
+      </w:r>
+      <w:r>
+        <w:rPr>
+          <w:rFonts w:ascii="Microsoft JhengHei" w:hAnsi="Microsoft JhengHei"/>
+        </w:rPr>
+        <w:t>90公分</w:t>
       </w:r>
     </w:p>
     <w:p>
@@ -1680,7 +2591,13 @@
         <w:rPr>
           <w:rFonts w:ascii="Microsoft JhengHei" w:hAnsi="Microsoft JhengHei"/>
         </w:rPr>
-        <w:t>26. 媽媽把兩杯一樣多的水倒進一個高瘦的杯子和一個矮胖的杯子，哪一個杯子裝的水比較多？還是同樣多？</w:t>
+        <w:t xml:space="preserve">26. </w:t>
+      </w:r>
+      <w:r>
+        <w:rPr>
+          <w:rFonts w:ascii="Microsoft JhengHei" w:hAnsi="Microsoft JhengHei"/>
+        </w:rPr>
+        <w:t>媽媽把兩杯一樣多的水倒進一個高瘦的杯子和一個矮胖的杯子，哪一個杯子裝的水比較多？還是同樣多？</w:t>
       </w:r>
     </w:p>
     <w:p>
@@ -1692,7 +2609,13 @@
         <w:rPr>
           <w:rFonts w:ascii="Microsoft JhengHei" w:hAnsi="Microsoft JhengHei"/>
         </w:rPr>
-        <w:t xml:space="preserve">   (A) 高瘦的杯子裝的水比較多</w:t>
+        <w:t xml:space="preserve">   (A) </w:t>
+      </w:r>
+      <w:r>
+        <w:rPr>
+          <w:rFonts w:ascii="Microsoft JhengHei" w:hAnsi="Microsoft JhengHei"/>
+        </w:rPr>
+        <w:t>高瘦的杯子裝的水比較多</w:t>
       </w:r>
     </w:p>
     <w:p>
@@ -1704,7 +2627,13 @@
         <w:rPr>
           <w:rFonts w:ascii="Microsoft JhengHei" w:hAnsi="Microsoft JhengHei"/>
         </w:rPr>
-        <w:t xml:space="preserve">   (B) 矮胖的杯子裝的水比較多</w:t>
+        <w:t xml:space="preserve">   (B) </w:t>
+      </w:r>
+      <w:r>
+        <w:rPr>
+          <w:rFonts w:ascii="Microsoft JhengHei" w:hAnsi="Microsoft JhengHei"/>
+        </w:rPr>
+        <w:t>矮胖的杯子裝的水比較多</w:t>
       </w:r>
     </w:p>
     <w:p>
@@ -1716,7 +2645,13 @@
         <w:rPr>
           <w:rFonts w:ascii="Microsoft JhengHei" w:hAnsi="Microsoft JhengHei"/>
         </w:rPr>
-        <w:t xml:space="preserve">   (C) 兩個杯子裝的水同樣多</w:t>
+        <w:t xml:space="preserve">   (C) </w:t>
+      </w:r>
+      <w:r>
+        <w:rPr>
+          <w:rFonts w:ascii="Microsoft JhengHei" w:hAnsi="Microsoft JhengHei"/>
+        </w:rPr>
+        <w:t>兩個杯子裝的水同樣多</w:t>
       </w:r>
     </w:p>
     <w:p>
@@ -1728,7 +2663,13 @@
         <w:rPr>
           <w:rFonts w:ascii="Microsoft JhengHei" w:hAnsi="Microsoft JhengHei"/>
         </w:rPr>
-        <w:t xml:space="preserve">   (D) 倒出來才知道，無法比較</w:t>
+        <w:t xml:space="preserve">   (D) </w:t>
+      </w:r>
+      <w:r>
+        <w:rPr>
+          <w:rFonts w:ascii="Microsoft JhengHei" w:hAnsi="Microsoft JhengHei"/>
+        </w:rPr>
+        <w:t>倒出來才知道，無法比較</w:t>
       </w:r>
     </w:p>
     <w:p>
@@ -1740,11 +2681,58 @@
         <w:rPr>
           <w:rFonts w:ascii="Microsoft JhengHei" w:hAnsi="Microsoft JhengHei"/>
         </w:rPr>
-        <w:t>27. 天平的左邊放3顆草莓，右邊放1顆蘋果，結果天平往右邊傾斜（下沉）。這代表什麼意思？</w:t>
+        <w:t xml:space="preserve">27. </w:t>
+      </w:r>
+      <w:r>
+        <w:rPr>
+          <w:rFonts w:ascii="Microsoft JhengHei" w:hAnsi="Microsoft JhengHei"/>
+        </w:rPr>
+        <w:t>天平的左邊放3顆草莓，右邊放1顆蘋果，結果天平往右邊傾斜（下沉）。這代表什麼意思？</w:t>
       </w:r>
     </w:p>
     <w:p>
       <w:pPr>
+        <w:spacing w:before="80" w:after="120"/>
+        <w:ind w:left="576"/>
+        <w:jc w:val="left"/>
+      </w:pPr>
+      <w:r>
+        <w:drawing>
+          <wp:inline xmlns:a="http://schemas.openxmlformats.org/drawingml/2006/main" xmlns:pic="http://schemas.openxmlformats.org/drawingml/2006/picture">
+            <wp:extent cx="2011680" cy="1098173"/>
+            <wp:docPr id="1" name="Picture 1"/>
+            <wp:cNvGraphicFramePr>
+              <a:graphicFrameLocks noChangeAspect="1"/>
+            </wp:cNvGraphicFramePr>
+            <a:graphic>
+              <a:graphicData uri="http://schemas.openxmlformats.org/drawingml/2006/picture">
+                <pic:pic>
+                  <pic:nvPicPr>
+                    <pic:cNvPr id="0" name="scale.png"/>
+                    <pic:cNvPicPr/>
+                  </pic:nvPicPr>
+                  <pic:blipFill>
+                    <a:blip r:embed="rId9"/>
+                    <a:stretch>
+                      <a:fillRect/>
+                    </a:stretch>
+                  </pic:blipFill>
+                  <pic:spPr>
+                    <a:xfrm>
+                      <a:off x="0" y="0"/>
+                      <a:ext cx="2011680" cy="1098173"/>
+                    </a:xfrm>
+                    <a:prstGeom prst="rect"/>
+                  </pic:spPr>
+                </pic:pic>
+              </a:graphicData>
+            </a:graphic>
+          </wp:inline>
+        </w:drawing>
+      </w:r>
+    </w:p>
+    <w:p>
+      <w:pPr>
         <w:spacing w:after="60"/>
         <w:ind w:left="576"/>
       </w:pPr>
@@ -1752,7 +2740,13 @@
         <w:rPr>
           <w:rFonts w:ascii="Microsoft JhengHei" w:hAnsi="Microsoft JhengHei"/>
         </w:rPr>
-        <w:t xml:space="preserve">   (A) 3顆草莓比1顆蘋果重</w:t>
+        <w:t xml:space="preserve">   (A) </w:t>
+      </w:r>
+      <w:r>
+        <w:rPr>
+          <w:rFonts w:ascii="Microsoft JhengHei" w:hAnsi="Microsoft JhengHei"/>
+        </w:rPr>
+        <w:t>3顆草莓比1顆蘋果重</w:t>
       </w:r>
     </w:p>
     <w:p>
@@ -1764,7 +2758,13 @@
         <w:rPr>
           <w:rFonts w:ascii="Microsoft JhengHei" w:hAnsi="Microsoft JhengHei"/>
         </w:rPr>
-        <w:t xml:space="preserve">   (B) 1顆蘋果比3顆草莓重</w:t>
+        <w:t xml:space="preserve">   (B) </w:t>
+      </w:r>
+      <w:r>
+        <w:rPr>
+          <w:rFonts w:ascii="Microsoft JhengHei" w:hAnsi="Microsoft JhengHei"/>
+        </w:rPr>
+        <w:t>1顆蘋果比3顆草莓重</w:t>
       </w:r>
     </w:p>
     <w:p>
@@ -1776,7 +2776,13 @@
         <w:rPr>
           <w:rFonts w:ascii="Microsoft JhengHei" w:hAnsi="Microsoft JhengHei"/>
         </w:rPr>
-        <w:t xml:space="preserve">   (C) 蘋果和草莓一樣重</w:t>
+        <w:t xml:space="preserve">   (C) </w:t>
+      </w:r>
+      <w:r>
+        <w:rPr>
+          <w:rFonts w:ascii="Microsoft JhengHei" w:hAnsi="Microsoft JhengHei"/>
+        </w:rPr>
+        <w:t>蘋果和草莓一樣重</w:t>
       </w:r>
     </w:p>
     <w:p>
@@ -1788,7 +2794,13 @@
         <w:rPr>
           <w:rFonts w:ascii="Microsoft JhengHei" w:hAnsi="Microsoft JhengHei"/>
         </w:rPr>
-        <w:t xml:space="preserve">   (D) 天平壞掉了</w:t>
+        <w:t xml:space="preserve">   (D) </w:t>
+      </w:r>
+      <w:r>
+        <w:rPr>
+          <w:rFonts w:ascii="Microsoft JhengHei" w:hAnsi="Microsoft JhengHei"/>
+        </w:rPr>
+        <w:t>天平壞掉了</w:t>
       </w:r>
     </w:p>
     <w:p>
@@ -1800,7 +2812,13 @@
         <w:rPr>
           <w:rFonts w:ascii="Microsoft JhengHei" w:hAnsi="Microsoft JhengHei"/>
         </w:rPr>
-        <w:t>28. 要怎麼比較兩瓶飲料哪一瓶裝的水比較多？以下哪一種是簡單又準確的比較方法？</w:t>
+        <w:t xml:space="preserve">28. </w:t>
+      </w:r>
+      <w:r>
+        <w:rPr>
+          <w:rFonts w:ascii="Microsoft JhengHei" w:hAnsi="Microsoft JhengHei"/>
+        </w:rPr>
+        <w:t>要怎麼比較兩瓶飲料哪一瓶裝的水比較多？以下哪一種是簡單又準確的比較方法？</w:t>
       </w:r>
     </w:p>
     <w:p>
@@ -1812,7 +2830,13 @@
         <w:rPr>
           <w:rFonts w:ascii="Microsoft JhengHei" w:hAnsi="Microsoft JhengHei"/>
         </w:rPr>
-        <w:t xml:space="preserve">   (A) 用手秤秤看哪一瓶比較重</w:t>
+        <w:t xml:space="preserve">   (A) </w:t>
+      </w:r>
+      <w:r>
+        <w:rPr>
+          <w:rFonts w:ascii="Microsoft JhengHei" w:hAnsi="Microsoft JhengHei"/>
+        </w:rPr>
+        <w:t>用手秤秤看哪一瓶比較重</w:t>
       </w:r>
     </w:p>
     <w:p>
@@ -1824,7 +2848,13 @@
         <w:rPr>
           <w:rFonts w:ascii="Microsoft JhengHei" w:hAnsi="Microsoft JhengHei"/>
         </w:rPr>
-        <w:t xml:space="preserve">   (B) 直接看瓶子的高度</w:t>
+        <w:t xml:space="preserve">   (B) </w:t>
+      </w:r>
+      <w:r>
+        <w:rPr>
+          <w:rFonts w:ascii="Microsoft JhengHei" w:hAnsi="Microsoft JhengHei"/>
+        </w:rPr>
+        <w:t>直接看瓶子的高度</w:t>
       </w:r>
     </w:p>
     <w:p>
@@ -1836,7 +2866,13 @@
         <w:rPr>
           <w:rFonts w:ascii="Microsoft JhengHei" w:hAnsi="Microsoft JhengHei"/>
         </w:rPr>
-        <w:t xml:space="preserve">   (C) 倒進兩個一模一樣的空杯子，比較水面的高度</w:t>
+        <w:t xml:space="preserve">   (C) </w:t>
+      </w:r>
+      <w:r>
+        <w:rPr>
+          <w:rFonts w:ascii="Microsoft JhengHei" w:hAnsi="Microsoft JhengHei"/>
+        </w:rPr>
+        <w:t>倒進兩個一模一樣的空杯子，比較水面的高度</w:t>
       </w:r>
     </w:p>
     <w:p>
@@ -1848,7 +2884,13 @@
         <w:rPr>
           <w:rFonts w:ascii="Microsoft JhengHei" w:hAnsi="Microsoft JhengHei"/>
         </w:rPr>
-        <w:t xml:space="preserve">   (D) 把水喝光，看誰喝得比較快</w:t>
+        <w:t xml:space="preserve">   (D) </w:t>
+      </w:r>
+      <w:r>
+        <w:rPr>
+          <w:rFonts w:ascii="Microsoft JhengHei" w:hAnsi="Microsoft JhengHei"/>
+        </w:rPr>
+        <w:t>把水喝光，看誰喝得比較快</w:t>
       </w:r>
     </w:p>
     <w:p>
@@ -1860,7 +2902,13 @@
         <w:rPr>
           <w:rFonts w:ascii="Microsoft JhengHei" w:hAnsi="Microsoft JhengHei"/>
         </w:rPr>
-        <w:t>29. 比較面積：數學課本的封面和學生的書桌桌面，哪一個的面積比較大？</w:t>
+        <w:t xml:space="preserve">29. </w:t>
+      </w:r>
+      <w:r>
+        <w:rPr>
+          <w:rFonts w:ascii="Microsoft JhengHei" w:hAnsi="Microsoft JhengHei"/>
+        </w:rPr>
+        <w:t>比較面積：數學課本的封面和學生的書桌桌面，哪一個的面積比較大？</w:t>
       </w:r>
     </w:p>
     <w:p>
@@ -1872,7 +2920,13 @@
         <w:rPr>
           <w:rFonts w:ascii="Microsoft JhengHei" w:hAnsi="Microsoft JhengHei"/>
         </w:rPr>
-        <w:t xml:space="preserve">   (A) 數學課本的封面比較大</w:t>
+        <w:t xml:space="preserve">   (A) </w:t>
+      </w:r>
+      <w:r>
+        <w:rPr>
+          <w:rFonts w:ascii="Microsoft JhengHei" w:hAnsi="Microsoft JhengHei"/>
+        </w:rPr>
+        <w:t>數學課本的封面比較大</w:t>
       </w:r>
     </w:p>
     <w:p>
@@ -1884,7 +2938,13 @@
         <w:rPr>
           <w:rFonts w:ascii="Microsoft JhengHei" w:hAnsi="Microsoft JhengHei"/>
         </w:rPr>
-        <w:t xml:space="preserve">   (B) 學生的書桌桌面比較大</w:t>
+        <w:t xml:space="preserve">   (B) </w:t>
+      </w:r>
+      <w:r>
+        <w:rPr>
+          <w:rFonts w:ascii="Microsoft JhengHei" w:hAnsi="Microsoft JhengHei"/>
+        </w:rPr>
+        <w:t>學生的書桌桌面比較大</w:t>
       </w:r>
     </w:p>
     <w:p>
@@ -1896,7 +2956,13 @@
         <w:rPr>
           <w:rFonts w:ascii="Microsoft JhengHei" w:hAnsi="Microsoft JhengHei"/>
         </w:rPr>
-        <w:t xml:space="preserve">   (C) 兩者一樣大</w:t>
+        <w:t xml:space="preserve">   (C) </w:t>
+      </w:r>
+      <w:r>
+        <w:rPr>
+          <w:rFonts w:ascii="Microsoft JhengHei" w:hAnsi="Microsoft JhengHei"/>
+        </w:rPr>
+        <w:t>兩者一樣大</w:t>
       </w:r>
     </w:p>
     <w:p>
@@ -1908,7 +2974,13 @@
         <w:rPr>
           <w:rFonts w:ascii="Microsoft JhengHei" w:hAnsi="Microsoft JhengHei"/>
         </w:rPr>
-        <w:t xml:space="preserve">   (D) 看哪一個比較厚決定</w:t>
+        <w:t xml:space="preserve">   (D) </w:t>
+      </w:r>
+      <w:r>
+        <w:rPr>
+          <w:rFonts w:ascii="Microsoft JhengHei" w:hAnsi="Microsoft JhengHei"/>
+        </w:rPr>
+        <w:t>看哪一個比較厚決定</w:t>
       </w:r>
     </w:p>
     <w:p>
@@ -1934,7 +3006,13 @@
         <w:rPr>
           <w:rFonts w:ascii="Microsoft JhengHei" w:hAnsi="Microsoft JhengHei"/>
         </w:rPr>
-        <w:t>30. 一小時有幾分鐘？一分鐘有幾秒鐘？</w:t>
+        <w:t xml:space="preserve">30. </w:t>
+      </w:r>
+      <w:r>
+        <w:rPr>
+          <w:rFonts w:ascii="Microsoft JhengHei" w:hAnsi="Microsoft JhengHei"/>
+        </w:rPr>
+        <w:t>一小時有幾分鐘？一分鐘有幾秒鐘？</w:t>
       </w:r>
     </w:p>
     <w:p>
@@ -1946,7 +3024,13 @@
         <w:rPr>
           <w:rFonts w:ascii="Microsoft JhengHei" w:hAnsi="Microsoft JhengHei"/>
         </w:rPr>
-        <w:t xml:space="preserve">   (A) 一小時有12分鐘，一分鐘有60秒鐘</w:t>
+        <w:t xml:space="preserve">   (A) </w:t>
+      </w:r>
+      <w:r>
+        <w:rPr>
+          <w:rFonts w:ascii="Microsoft JhengHei" w:hAnsi="Microsoft JhengHei"/>
+        </w:rPr>
+        <w:t>一小時有12分鐘，一分鐘有60秒鐘</w:t>
       </w:r>
     </w:p>
     <w:p>
@@ -1958,7 +3042,13 @@
         <w:rPr>
           <w:rFonts w:ascii="Microsoft JhengHei" w:hAnsi="Microsoft JhengHei"/>
         </w:rPr>
-        <w:t xml:space="preserve">   (B) 一小時有60分鐘，一分鐘有60秒鐘</w:t>
+        <w:t xml:space="preserve">   (B) </w:t>
+      </w:r>
+      <w:r>
+        <w:rPr>
+          <w:rFonts w:ascii="Microsoft JhengHei" w:hAnsi="Microsoft JhengHei"/>
+        </w:rPr>
+        <w:t>一小時有60分鐘，一分鐘有60秒鐘</w:t>
       </w:r>
     </w:p>
     <w:p>
@@ -1970,7 +3060,13 @@
         <w:rPr>
           <w:rFonts w:ascii="Microsoft JhengHei" w:hAnsi="Microsoft JhengHei"/>
         </w:rPr>
-        <w:t xml:space="preserve">   (C) 一小時有60分鐘，一分鐘有24秒鐘</w:t>
+        <w:t xml:space="preserve">   (C) </w:t>
+      </w:r>
+      <w:r>
+        <w:rPr>
+          <w:rFonts w:ascii="Microsoft JhengHei" w:hAnsi="Microsoft JhengHei"/>
+        </w:rPr>
+        <w:t>一小時有60分鐘，一分鐘有24秒鐘</w:t>
       </w:r>
     </w:p>
     <w:p>
@@ -1982,7 +3078,13 @@
         <w:rPr>
           <w:rFonts w:ascii="Microsoft JhengHei" w:hAnsi="Microsoft JhengHei"/>
         </w:rPr>
-        <w:t xml:space="preserve">   (D) 一小時有24分鐘，一分鐘有60秒鐘</w:t>
+        <w:t xml:space="preserve">   (D) </w:t>
+      </w:r>
+      <w:r>
+        <w:rPr>
+          <w:rFonts w:ascii="Microsoft JhengHei" w:hAnsi="Microsoft JhengHei"/>
+        </w:rPr>
+        <w:t>一小時有24分鐘，一分鐘有60秒鐘</w:t>
       </w:r>
     </w:p>
     <w:p>
@@ -1994,7 +3096,13 @@
         <w:rPr>
           <w:rFonts w:ascii="Microsoft JhengHei" w:hAnsi="Microsoft JhengHei"/>
         </w:rPr>
-        <w:t>31. 小明下午 4 點 15 分放學，這時候的時鐘應該是哪一個？</w:t>
+        <w:t xml:space="preserve">31. </w:t>
+      </w:r>
+      <w:r>
+        <w:rPr>
+          <w:rFonts w:ascii="Microsoft JhengHei" w:hAnsi="Microsoft JhengHei"/>
+        </w:rPr>
+        <w:t>小明下午 4 點 15 分放學，這時候的時鐘應該是哪一個？</w:t>
       </w:r>
     </w:p>
     <w:p>
@@ -2006,7 +3114,13 @@
         <w:rPr>
           <w:rFonts w:ascii="Microsoft JhengHei" w:hAnsi="Microsoft JhengHei"/>
         </w:rPr>
-        <w:t xml:space="preserve">   (A) 3:15</w:t>
+        <w:t xml:space="preserve">   (A) </w:t>
+      </w:r>
+      <w:r>
+        <w:rPr>
+          <w:rFonts w:ascii="Microsoft JhengHei" w:hAnsi="Microsoft JhengHei"/>
+        </w:rPr>
+        <w:t>3:15</w:t>
       </w:r>
     </w:p>
     <w:p>
@@ -2018,7 +3132,13 @@
         <w:rPr>
           <w:rFonts w:ascii="Microsoft JhengHei" w:hAnsi="Microsoft JhengHei"/>
         </w:rPr>
-        <w:t xml:space="preserve">   (B) 4:15</w:t>
+        <w:t xml:space="preserve">   (B) </w:t>
+      </w:r>
+      <w:r>
+        <w:rPr>
+          <w:rFonts w:ascii="Microsoft JhengHei" w:hAnsi="Microsoft JhengHei"/>
+        </w:rPr>
+        <w:t>4:15</w:t>
       </w:r>
     </w:p>
     <w:p>
@@ -2030,7 +3150,13 @@
         <w:rPr>
           <w:rFonts w:ascii="Microsoft JhengHei" w:hAnsi="Microsoft JhengHei"/>
         </w:rPr>
-        <w:t xml:space="preserve">   (C) 4:03</w:t>
+        <w:t xml:space="preserve">   (C) </w:t>
+      </w:r>
+      <w:r>
+        <w:rPr>
+          <w:rFonts w:ascii="Microsoft JhengHei" w:hAnsi="Microsoft JhengHei"/>
+        </w:rPr>
+        <w:t>4:03</w:t>
       </w:r>
     </w:p>
     <w:p>
@@ -2042,7 +3168,13 @@
         <w:rPr>
           <w:rFonts w:ascii="Microsoft JhengHei" w:hAnsi="Microsoft JhengHei"/>
         </w:rPr>
-        <w:t xml:space="preserve">   (D) 5:15</w:t>
+        <w:t xml:space="preserve">   (D) </w:t>
+      </w:r>
+      <w:r>
+        <w:rPr>
+          <w:rFonts w:ascii="Microsoft JhengHei" w:hAnsi="Microsoft JhengHei"/>
+        </w:rPr>
+        <w:t>5:15</w:t>
       </w:r>
     </w:p>
     <w:p>
@@ -2054,7 +3186,13 @@
         <w:rPr>
           <w:rFonts w:ascii="Microsoft JhengHei" w:hAnsi="Microsoft JhengHei"/>
         </w:rPr>
-        <w:t>32. 填填看：一年有幾個月？一星期有幾天？</w:t>
+        <w:t xml:space="preserve">32. </w:t>
+      </w:r>
+      <w:r>
+        <w:rPr>
+          <w:rFonts w:ascii="Microsoft JhengHei" w:hAnsi="Microsoft JhengHei"/>
+        </w:rPr>
+        <w:t>填填看：一年有幾個月？一星期有幾天？</w:t>
       </w:r>
     </w:p>
     <w:p>
@@ -2066,7 +3204,13 @@
         <w:rPr>
           <w:rFonts w:ascii="Microsoft JhengHei" w:hAnsi="Microsoft JhengHei"/>
         </w:rPr>
-        <w:t xml:space="preserve">   (A) 一年有10個月，一星期有7天</w:t>
+        <w:t xml:space="preserve">   (A) </w:t>
+      </w:r>
+      <w:r>
+        <w:rPr>
+          <w:rFonts w:ascii="Microsoft JhengHei" w:hAnsi="Microsoft JhengHei"/>
+        </w:rPr>
+        <w:t>一年有10個月，一星期有7天</w:t>
       </w:r>
     </w:p>
     <w:p>
@@ -2078,7 +3222,13 @@
         <w:rPr>
           <w:rFonts w:ascii="Microsoft JhengHei" w:hAnsi="Microsoft JhengHei"/>
         </w:rPr>
-        <w:t xml:space="preserve">   (B) 一年有12個月，一星期有5天</w:t>
+        <w:t xml:space="preserve">   (B) </w:t>
+      </w:r>
+      <w:r>
+        <w:rPr>
+          <w:rFonts w:ascii="Microsoft JhengHei" w:hAnsi="Microsoft JhengHei"/>
+        </w:rPr>
+        <w:t>一年有12個月，一星期有5天</w:t>
       </w:r>
     </w:p>
     <w:p>
@@ -2090,7 +3240,13 @@
         <w:rPr>
           <w:rFonts w:ascii="Microsoft JhengHei" w:hAnsi="Microsoft JhengHei"/>
         </w:rPr>
-        <w:t xml:space="preserve">   (C) 一年有12個月，一星期有7天</w:t>
+        <w:t xml:space="preserve">   (C) </w:t>
+      </w:r>
+      <w:r>
+        <w:rPr>
+          <w:rFonts w:ascii="Microsoft JhengHei" w:hAnsi="Microsoft JhengHei"/>
+        </w:rPr>
+        <w:t>一年有12個月，一星期有7天</w:t>
       </w:r>
     </w:p>
     <w:p>
@@ -2102,7 +3258,13 @@
         <w:rPr>
           <w:rFonts w:ascii="Microsoft JhengHei" w:hAnsi="Microsoft JhengHei"/>
         </w:rPr>
-        <w:t xml:space="preserve">   (D) 一年有365個月，一星期有7天</w:t>
+        <w:t xml:space="preserve">   (D) </w:t>
+      </w:r>
+      <w:r>
+        <w:rPr>
+          <w:rFonts w:ascii="Microsoft JhengHei" w:hAnsi="Microsoft JhengHei"/>
+        </w:rPr>
+        <w:t>一年有365個月，一星期有7天</w:t>
       </w:r>
     </w:p>
     <w:p>
@@ -2114,11 +3276,58 @@
         <w:rPr>
           <w:rFonts w:ascii="Microsoft JhengHei" w:hAnsi="Microsoft JhengHei"/>
         </w:rPr>
-        <w:t>33. 今天的日期是115年7月3日（星期五），昨天和明天的日期、星期各是多少？</w:t>
+        <w:t xml:space="preserve">33. </w:t>
+      </w:r>
+      <w:r>
+        <w:rPr>
+          <w:rFonts w:ascii="Microsoft JhengHei" w:hAnsi="Microsoft JhengHei"/>
+        </w:rPr>
+        <w:t>今天的日期是115年7月3日（星期五），昨天和明天的日期、星期各是多少？</w:t>
       </w:r>
     </w:p>
     <w:p>
       <w:pPr>
+        <w:spacing w:before="80" w:after="120"/>
+        <w:ind w:left="576"/>
+        <w:jc w:val="left"/>
+      </w:pPr>
+      <w:r>
+        <w:drawing>
+          <wp:inline xmlns:a="http://schemas.openxmlformats.org/drawingml/2006/main" xmlns:pic="http://schemas.openxmlformats.org/drawingml/2006/picture">
+            <wp:extent cx="2011680" cy="1098173"/>
+            <wp:docPr id="2" name="Picture 2"/>
+            <wp:cNvGraphicFramePr>
+              <a:graphicFrameLocks noChangeAspect="1"/>
+            </wp:cNvGraphicFramePr>
+            <a:graphic>
+              <a:graphicData uri="http://schemas.openxmlformats.org/drawingml/2006/picture">
+                <pic:pic>
+                  <pic:nvPicPr>
+                    <pic:cNvPr id="0" name="calendar.png"/>
+                    <pic:cNvPicPr/>
+                  </pic:nvPicPr>
+                  <pic:blipFill>
+                    <a:blip r:embed="rId10"/>
+                    <a:stretch>
+                      <a:fillRect/>
+                    </a:stretch>
+                  </pic:blipFill>
+                  <pic:spPr>
+                    <a:xfrm>
+                      <a:off x="0" y="0"/>
+                      <a:ext cx="2011680" cy="1098173"/>
+                    </a:xfrm>
+                    <a:prstGeom prst="rect"/>
+                  </pic:spPr>
+                </pic:pic>
+              </a:graphicData>
+            </a:graphic>
+          </wp:inline>
+        </w:drawing>
+      </w:r>
+    </w:p>
+    <w:p>
+      <w:pPr>
         <w:spacing w:after="60"/>
         <w:ind w:left="576"/>
       </w:pPr>
@@ -2126,7 +3335,13 @@
         <w:rPr>
           <w:rFonts w:ascii="Microsoft JhengHei" w:hAnsi="Microsoft JhengHei"/>
         </w:rPr>
-        <w:t xml:space="preserve">   (A) 昨天是7月2日（星期四），明天是7月4日（星期六）</w:t>
+        <w:t xml:space="preserve">   (A) </w:t>
+      </w:r>
+      <w:r>
+        <w:rPr>
+          <w:rFonts w:ascii="Microsoft JhengHei" w:hAnsi="Microsoft JhengHei"/>
+        </w:rPr>
+        <w:t>昨天是7月2日（星期四），明天是7月4日（星期六）</w:t>
       </w:r>
     </w:p>
     <w:p>
@@ -2138,7 +3353,13 @@
         <w:rPr>
           <w:rFonts w:ascii="Microsoft JhengHei" w:hAnsi="Microsoft JhengHei"/>
         </w:rPr>
-        <w:t xml:space="preserve">   (B) 昨天是7月2日（星期六），明天是7月4日（星期四）</w:t>
+        <w:t xml:space="preserve">   (B) </w:t>
+      </w:r>
+      <w:r>
+        <w:rPr>
+          <w:rFonts w:ascii="Microsoft JhengHei" w:hAnsi="Microsoft JhengHei"/>
+        </w:rPr>
+        <w:t>昨天是7月2日（星期六），明天是7月4日（星期四）</w:t>
       </w:r>
     </w:p>
     <w:p>
@@ -2150,7 +3371,13 @@
         <w:rPr>
           <w:rFonts w:ascii="Microsoft JhengHei" w:hAnsi="Microsoft JhengHei"/>
         </w:rPr>
-        <w:t xml:space="preserve">   (C) 昨天是7月4日（星期四），明天是7月2日（星期六）</w:t>
+        <w:t xml:space="preserve">   (C) </w:t>
+      </w:r>
+      <w:r>
+        <w:rPr>
+          <w:rFonts w:ascii="Microsoft JhengHei" w:hAnsi="Microsoft JhengHei"/>
+        </w:rPr>
+        <w:t>昨天是7月4日（星期四），明天是7月2日（星期六）</w:t>
       </w:r>
     </w:p>
     <w:p>
@@ -2162,7 +3389,13 @@
         <w:rPr>
           <w:rFonts w:ascii="Microsoft JhengHei" w:hAnsi="Microsoft JhengHei"/>
         </w:rPr>
-        <w:t xml:space="preserve">   (D) 昨天是6月30日（星期四），明天是7月4日（星期六）</w:t>
+        <w:t xml:space="preserve">   (D) </w:t>
+      </w:r>
+      <w:r>
+        <w:rPr>
+          <w:rFonts w:ascii="Microsoft JhengHei" w:hAnsi="Microsoft JhengHei"/>
+        </w:rPr>
+        <w:t>昨天是6月30日（星期四），明天是7月4日（星期六）</w:t>
       </w:r>
     </w:p>
     <w:p>
@@ -2174,11 +3407,58 @@
         <w:rPr>
           <w:rFonts w:ascii="Microsoft JhengHei" w:hAnsi="Microsoft JhengHei"/>
         </w:rPr>
-        <w:t>34. 小美早上8點開始上課，到中午12點吃午餐。她一共上了幾個小時的課？</w:t>
+        <w:t xml:space="preserve">34. </w:t>
+      </w:r>
+      <w:r>
+        <w:rPr>
+          <w:rFonts w:ascii="Microsoft JhengHei" w:hAnsi="Microsoft JhengHei"/>
+        </w:rPr>
+        <w:t>小美早上8點開始上課，到中午12點吃午餐。她一共上了幾個小時的課？</w:t>
       </w:r>
     </w:p>
     <w:p>
       <w:pPr>
+        <w:spacing w:before="80" w:after="120"/>
+        <w:ind w:left="576"/>
+        <w:jc w:val="left"/>
+      </w:pPr>
+      <w:r>
+        <w:drawing>
+          <wp:inline xmlns:a="http://schemas.openxmlformats.org/drawingml/2006/main" xmlns:pic="http://schemas.openxmlformats.org/drawingml/2006/picture">
+            <wp:extent cx="2011680" cy="1098173"/>
+            <wp:docPr id="3" name="Picture 3"/>
+            <wp:cNvGraphicFramePr>
+              <a:graphicFrameLocks noChangeAspect="1"/>
+            </wp:cNvGraphicFramePr>
+            <a:graphic>
+              <a:graphicData uri="http://schemas.openxmlformats.org/drawingml/2006/picture">
+                <pic:pic>
+                  <pic:nvPicPr>
+                    <pic:cNvPr id="0" name="clock8.png"/>
+                    <pic:cNvPicPr/>
+                  </pic:nvPicPr>
+                  <pic:blipFill>
+                    <a:blip r:embed="rId11"/>
+                    <a:stretch>
+                      <a:fillRect/>
+                    </a:stretch>
+                  </pic:blipFill>
+                  <pic:spPr>
+                    <a:xfrm>
+                      <a:off x="0" y="0"/>
+                      <a:ext cx="2011680" cy="1098173"/>
+                    </a:xfrm>
+                    <a:prstGeom prst="rect"/>
+                  </pic:spPr>
+                </pic:pic>
+              </a:graphicData>
+            </a:graphic>
+          </wp:inline>
+        </w:drawing>
+      </w:r>
+    </w:p>
+    <w:p>
+      <w:pPr>
         <w:spacing w:after="60"/>
         <w:ind w:left="576"/>
       </w:pPr>
@@ -2186,7 +3466,13 @@
         <w:rPr>
           <w:rFonts w:ascii="Microsoft JhengHei" w:hAnsi="Microsoft JhengHei"/>
         </w:rPr>
-        <w:t xml:space="preserve">   (A) 2個小時</w:t>
+        <w:t xml:space="preserve">   (A) </w:t>
+      </w:r>
+      <w:r>
+        <w:rPr>
+          <w:rFonts w:ascii="Microsoft JhengHei" w:hAnsi="Microsoft JhengHei"/>
+        </w:rPr>
+        <w:t>2個小時</w:t>
       </w:r>
     </w:p>
     <w:p>
@@ -2198,7 +3484,13 @@
         <w:rPr>
           <w:rFonts w:ascii="Microsoft JhengHei" w:hAnsi="Microsoft JhengHei"/>
         </w:rPr>
-        <w:t xml:space="preserve">   (B) 4個小時</w:t>
+        <w:t xml:space="preserve">   (B) </w:t>
+      </w:r>
+      <w:r>
+        <w:rPr>
+          <w:rFonts w:ascii="Microsoft JhengHei" w:hAnsi="Microsoft JhengHei"/>
+        </w:rPr>
+        <w:t>4個小時</w:t>
       </w:r>
     </w:p>
     <w:p>
@@ -2210,7 +3502,13 @@
         <w:rPr>
           <w:rFonts w:ascii="Microsoft JhengHei" w:hAnsi="Microsoft JhengHei"/>
         </w:rPr>
-        <w:t xml:space="preserve">   (C) 8個小時</w:t>
+        <w:t xml:space="preserve">   (C) </w:t>
+      </w:r>
+      <w:r>
+        <w:rPr>
+          <w:rFonts w:ascii="Microsoft JhengHei" w:hAnsi="Microsoft JhengHei"/>
+        </w:rPr>
+        <w:t>8個小時</w:t>
       </w:r>
     </w:p>
     <w:p>
@@ -2222,7 +3520,13 @@
         <w:rPr>
           <w:rFonts w:ascii="Microsoft JhengHei" w:hAnsi="Microsoft JhengHei"/>
         </w:rPr>
-        <w:t xml:space="preserve">   (D) 12個小時</w:t>
+        <w:t xml:space="preserve">   (D) </w:t>
+      </w:r>
+      <w:r>
+        <w:rPr>
+          <w:rFonts w:ascii="Microsoft JhengHei" w:hAnsi="Microsoft JhengHei"/>
+        </w:rPr>
+        <w:t>12個小時</w:t>
       </w:r>
     </w:p>
     <w:p>
@@ -2236,7 +3540,7 @@
           <w:color w:val="388E3C"/>
           <w:sz w:val="28"/>
         </w:rPr>
-        <w:t>🦖 第三關：暴龍獵場 (空間幾何與應用篇)</w:t>
+        <w:t>Rex 第三關：暴龍獵場 (空間幾何與應用篇)</w:t>
       </w:r>
     </w:p>
     <w:p>
@@ -2262,7 +3566,13 @@
         <w:rPr>
           <w:rFonts w:ascii="Microsoft JhengHei" w:hAnsi="Microsoft JhengHei"/>
         </w:rPr>
-        <w:t>35. 長方體一共有幾個面？幾個頂點？</w:t>
+        <w:t xml:space="preserve">35. </w:t>
+      </w:r>
+      <w:r>
+        <w:rPr>
+          <w:rFonts w:ascii="Microsoft JhengHei" w:hAnsi="Microsoft JhengHei"/>
+        </w:rPr>
+        <w:t>長方體一共有幾個面？幾個頂點？</w:t>
       </w:r>
     </w:p>
     <w:p>
@@ -2274,7 +3584,13 @@
         <w:rPr>
           <w:rFonts w:ascii="Microsoft JhengHei" w:hAnsi="Microsoft JhengHei"/>
         </w:rPr>
-        <w:t xml:space="preserve">   (A) 4個面，4個頂點</w:t>
+        <w:t xml:space="preserve">   (A) </w:t>
+      </w:r>
+      <w:r>
+        <w:rPr>
+          <w:rFonts w:ascii="Microsoft JhengHei" w:hAnsi="Microsoft JhengHei"/>
+        </w:rPr>
+        <w:t>4個面，4個頂點</w:t>
       </w:r>
     </w:p>
     <w:p>
@@ -2286,7 +3602,13 @@
         <w:rPr>
           <w:rFonts w:ascii="Microsoft JhengHei" w:hAnsi="Microsoft JhengHei"/>
         </w:rPr>
-        <w:t xml:space="preserve">   (B) 6個面，8個頂點</w:t>
+        <w:t xml:space="preserve">   (B) </w:t>
+      </w:r>
+      <w:r>
+        <w:rPr>
+          <w:rFonts w:ascii="Microsoft JhengHei" w:hAnsi="Microsoft JhengHei"/>
+        </w:rPr>
+        <w:t>6個面，8個頂點</w:t>
       </w:r>
     </w:p>
     <w:p>
@@ -2298,7 +3620,13 @@
         <w:rPr>
           <w:rFonts w:ascii="Microsoft JhengHei" w:hAnsi="Microsoft JhengHei"/>
         </w:rPr>
-        <w:t xml:space="preserve">   (C) 8個面，6個頂點</w:t>
+        <w:t xml:space="preserve">   (C) </w:t>
+      </w:r>
+      <w:r>
+        <w:rPr>
+          <w:rFonts w:ascii="Microsoft JhengHei" w:hAnsi="Microsoft JhengHei"/>
+        </w:rPr>
+        <w:t>8個面，6個頂點</w:t>
       </w:r>
     </w:p>
     <w:p>
@@ -2310,7 +3638,13 @@
         <w:rPr>
           <w:rFonts w:ascii="Microsoft JhengHei" w:hAnsi="Microsoft JhengHei"/>
         </w:rPr>
-        <w:t xml:space="preserve">   (D) 6個面，12個頂點</w:t>
+        <w:t xml:space="preserve">   (D) </w:t>
+      </w:r>
+      <w:r>
+        <w:rPr>
+          <w:rFonts w:ascii="Microsoft JhengHei" w:hAnsi="Microsoft JhengHei"/>
+        </w:rPr>
+        <w:t>6個面，12個頂點</w:t>
       </w:r>
     </w:p>
     <w:p>
@@ -2322,7 +3656,13 @@
         <w:rPr>
           <w:rFonts w:ascii="Microsoft JhengHei" w:hAnsi="Microsoft JhengHei"/>
         </w:rPr>
-        <w:t>36. 教室裡的黑板、考卷和課桌表面，它們的表面通常是什麼平面形狀？</w:t>
+        <w:t xml:space="preserve">36. </w:t>
+      </w:r>
+      <w:r>
+        <w:rPr>
+          <w:rFonts w:ascii="Microsoft JhengHei" w:hAnsi="Microsoft JhengHei"/>
+        </w:rPr>
+        <w:t>教室裡的黑板、考卷和課桌表面，它們的表面通常是什麼平面形狀？</w:t>
       </w:r>
     </w:p>
     <w:p>
@@ -2334,7 +3674,13 @@
         <w:rPr>
           <w:rFonts w:ascii="Microsoft JhengHei" w:hAnsi="Microsoft JhengHei"/>
         </w:rPr>
-        <w:t xml:space="preserve">   (A) 正方形</w:t>
+        <w:t xml:space="preserve">   (A) </w:t>
+      </w:r>
+      <w:r>
+        <w:rPr>
+          <w:rFonts w:ascii="Microsoft JhengHei" w:hAnsi="Microsoft JhengHei"/>
+        </w:rPr>
+        <w:t>正方形</w:t>
       </w:r>
     </w:p>
     <w:p>
@@ -2346,7 +3692,13 @@
         <w:rPr>
           <w:rFonts w:ascii="Microsoft JhengHei" w:hAnsi="Microsoft JhengHei"/>
         </w:rPr>
-        <w:t xml:space="preserve">   (B) 三角形</w:t>
+        <w:t xml:space="preserve">   (B) </w:t>
+      </w:r>
+      <w:r>
+        <w:rPr>
+          <w:rFonts w:ascii="Microsoft JhengHei" w:hAnsi="Microsoft JhengHei"/>
+        </w:rPr>
+        <w:t>三角形</w:t>
       </w:r>
     </w:p>
     <w:p>
@@ -2358,7 +3710,13 @@
         <w:rPr>
           <w:rFonts w:ascii="Microsoft JhengHei" w:hAnsi="Microsoft JhengHei"/>
         </w:rPr>
-        <w:t xml:space="preserve">   (C) 圓形</w:t>
+        <w:t xml:space="preserve">   (C) </w:t>
+      </w:r>
+      <w:r>
+        <w:rPr>
+          <w:rFonts w:ascii="Microsoft JhengHei" w:hAnsi="Microsoft JhengHei"/>
+        </w:rPr>
+        <w:t>圓形</w:t>
       </w:r>
     </w:p>
     <w:p>
@@ -2370,7 +3728,13 @@
         <w:rPr>
           <w:rFonts w:ascii="Microsoft JhengHei" w:hAnsi="Microsoft JhengHei"/>
         </w:rPr>
-        <w:t xml:space="preserve">   (D) 長方形</w:t>
+        <w:t xml:space="preserve">   (D) </w:t>
+      </w:r>
+      <w:r>
+        <w:rPr>
+          <w:rFonts w:ascii="Microsoft JhengHei" w:hAnsi="Microsoft JhengHei"/>
+        </w:rPr>
+        <w:t>長方形</w:t>
       </w:r>
     </w:p>
     <w:p>
@@ -2382,7 +3746,13 @@
         <w:rPr>
           <w:rFonts w:ascii="Microsoft JhengHei" w:hAnsi="Microsoft JhengHei"/>
         </w:rPr>
-        <w:t>37. 正方形有幾個角？幾條邊？它的邊有什麼特別的特徵？</w:t>
+        <w:t xml:space="preserve">37. </w:t>
+      </w:r>
+      <w:r>
+        <w:rPr>
+          <w:rFonts w:ascii="Microsoft JhengHei" w:hAnsi="Microsoft JhengHei"/>
+        </w:rPr>
+        <w:t>正方形有幾個角？幾條邊？它的邊有什麼特別的特徵？</w:t>
       </w:r>
     </w:p>
     <w:p>
@@ -2394,7 +3764,13 @@
         <w:rPr>
           <w:rFonts w:ascii="Microsoft JhengHei" w:hAnsi="Microsoft JhengHei"/>
         </w:rPr>
-        <w:t xml:space="preserve">   (A) 4個角、4條邊，4條邊都不一樣長</w:t>
+        <w:t xml:space="preserve">   (A) </w:t>
+      </w:r>
+      <w:r>
+        <w:rPr>
+          <w:rFonts w:ascii="Microsoft JhengHei" w:hAnsi="Microsoft JhengHei"/>
+        </w:rPr>
+        <w:t>4個角、4條邊，4條邊都不一樣長</w:t>
       </w:r>
     </w:p>
     <w:p>
@@ -2406,7 +3782,13 @@
         <w:rPr>
           <w:rFonts w:ascii="Microsoft JhengHei" w:hAnsi="Microsoft JhengHei"/>
         </w:rPr>
-        <w:t xml:space="preserve">   (B) 4個角、4條邊，對邊一樣長</w:t>
+        <w:t xml:space="preserve">   (B) </w:t>
+      </w:r>
+      <w:r>
+        <w:rPr>
+          <w:rFonts w:ascii="Microsoft JhengHei" w:hAnsi="Microsoft JhengHei"/>
+        </w:rPr>
+        <w:t>4個角、4條邊，對邊一樣長</w:t>
       </w:r>
     </w:p>
     <w:p>
@@ -2418,7 +3800,13 @@
         <w:rPr>
           <w:rFonts w:ascii="Microsoft JhengHei" w:hAnsi="Microsoft JhengHei"/>
         </w:rPr>
-        <w:t xml:space="preserve">   (C) 4個角、4條邊，4條邊都一樣長</w:t>
+        <w:t xml:space="preserve">   (C) </w:t>
+      </w:r>
+      <w:r>
+        <w:rPr>
+          <w:rFonts w:ascii="Microsoft JhengHei" w:hAnsi="Microsoft JhengHei"/>
+        </w:rPr>
+        <w:t>4個角、4條邊，4條邊都一樣長</w:t>
       </w:r>
     </w:p>
     <w:p>
@@ -2430,7 +3818,13 @@
         <w:rPr>
           <w:rFonts w:ascii="Microsoft JhengHei" w:hAnsi="Microsoft JhengHei"/>
         </w:rPr>
-        <w:t xml:space="preserve">   (D) 3個角、3條邊，3條邊都一樣長</w:t>
+        <w:t xml:space="preserve">   (D) </w:t>
+      </w:r>
+      <w:r>
+        <w:rPr>
+          <w:rFonts w:ascii="Microsoft JhengHei" w:hAnsi="Microsoft JhengHei"/>
+        </w:rPr>
+        <w:t>3個角、3條邊，3條邊都一樣長</w:t>
       </w:r>
     </w:p>
     <w:p>
@@ -2456,7 +3850,13 @@
         <w:rPr>
           <w:rFonts w:ascii="Microsoft JhengHei" w:hAnsi="Microsoft JhengHei"/>
         </w:rPr>
-        <w:t>38. 下列何者是將「十加八等於十八」和「十五減七等於八」寫成數學算式的正確寫法？</w:t>
+        <w:t xml:space="preserve">38. </w:t>
+      </w:r>
+      <w:r>
+        <w:rPr>
+          <w:rFonts w:ascii="Microsoft JhengHei" w:hAnsi="Microsoft JhengHei"/>
+        </w:rPr>
+        <w:t>下列何者是將「十加八等於十八」和「十五減七等於八」寫成數學算式的正確寫法？</w:t>
       </w:r>
     </w:p>
     <w:p>
@@ -2468,7 +3868,13 @@
         <w:rPr>
           <w:rFonts w:ascii="Microsoft JhengHei" w:hAnsi="Microsoft JhengHei"/>
         </w:rPr>
-        <w:t xml:space="preserve">   (A) 10 + 8 = 18；15 - 7 = 8</w:t>
+        <w:t xml:space="preserve">   (A) </w:t>
+      </w:r>
+      <w:r>
+        <w:rPr>
+          <w:rFonts w:ascii="Microsoft JhengHei" w:hAnsi="Microsoft JhengHei"/>
+        </w:rPr>
+        <w:t>10 + 8 = 18；15 - 7 = 8</w:t>
       </w:r>
     </w:p>
     <w:p>
@@ -2480,7 +3886,13 @@
         <w:rPr>
           <w:rFonts w:ascii="Microsoft JhengHei" w:hAnsi="Microsoft JhengHei"/>
         </w:rPr>
-        <w:t xml:space="preserve">   (B) 10 - 8 = 2；15 + 7 = 22</w:t>
+        <w:t xml:space="preserve">   (B) </w:t>
+      </w:r>
+      <w:r>
+        <w:rPr>
+          <w:rFonts w:ascii="Microsoft JhengHei" w:hAnsi="Microsoft JhengHei"/>
+        </w:rPr>
+        <w:t>10 - 8 = 2；15 + 7 = 22</w:t>
       </w:r>
     </w:p>
     <w:p>
@@ -2492,7 +3904,13 @@
         <w:rPr>
           <w:rFonts w:ascii="Microsoft JhengHei" w:hAnsi="Microsoft JhengHei"/>
         </w:rPr>
-        <w:t xml:space="preserve">   (C) 10 + 8 = 18；15 = 7 - 8</w:t>
+        <w:t xml:space="preserve">   (C) </w:t>
+      </w:r>
+      <w:r>
+        <w:rPr>
+          <w:rFonts w:ascii="Microsoft JhengHei" w:hAnsi="Microsoft JhengHei"/>
+        </w:rPr>
+        <w:t>10 + 8 = 18；15 = 7 - 8</w:t>
       </w:r>
     </w:p>
     <w:p>
@@ -2504,7 +3922,13 @@
         <w:rPr>
           <w:rFonts w:ascii="Microsoft JhengHei" w:hAnsi="Microsoft JhengHei"/>
         </w:rPr>
-        <w:t xml:space="preserve">   (D) 10 × 8 = 18；15 ÷ 7 = 8</w:t>
+        <w:t xml:space="preserve">   (D) </w:t>
+      </w:r>
+      <w:r>
+        <w:rPr>
+          <w:rFonts w:ascii="Microsoft JhengHei" w:hAnsi="Microsoft JhengHei"/>
+        </w:rPr>
+        <w:t>10 × 8 = 18；15 ÷ 7 = 8</w:t>
       </w:r>
     </w:p>
     <w:p>
@@ -2516,7 +3940,13 @@
         <w:rPr>
           <w:rFonts w:ascii="Microsoft JhengHei" w:hAnsi="Microsoft JhengHei"/>
         </w:rPr>
-        <w:t>39. 在算式「12 - 4 = 8」中，這個算式中的「=」讀作什麼？代表等號兩邊的數量關係是什麼？</w:t>
+        <w:t xml:space="preserve">39. </w:t>
+      </w:r>
+      <w:r>
+        <w:rPr>
+          <w:rFonts w:ascii="Microsoft JhengHei" w:hAnsi="Microsoft JhengHei"/>
+        </w:rPr>
+        <w:t>在算式「12 - 4 = 8」中，這個算式中的「=」讀作什麼？代表等號兩邊的數量關係是什麼？</w:t>
       </w:r>
     </w:p>
     <w:p>
@@ -2528,7 +3958,13 @@
         <w:rPr>
           <w:rFonts w:ascii="Microsoft JhengHei" w:hAnsi="Microsoft JhengHei"/>
         </w:rPr>
-        <w:t xml:space="preserve">   (A) 讀作「減去」，代表左邊比右邊多</w:t>
+        <w:t xml:space="preserve">   (A) </w:t>
+      </w:r>
+      <w:r>
+        <w:rPr>
+          <w:rFonts w:ascii="Microsoft JhengHei" w:hAnsi="Microsoft JhengHei"/>
+        </w:rPr>
+        <w:t>讀作「減去」，代表左邊比右邊多</w:t>
       </w:r>
     </w:p>
     <w:p>
@@ -2540,7 +3976,13 @@
         <w:rPr>
           <w:rFonts w:ascii="Microsoft JhengHei" w:hAnsi="Microsoft JhengHei"/>
         </w:rPr>
-        <w:t xml:space="preserve">   (B) 讀作「等於」，代表兩邊數量相等（一樣多）</w:t>
+        <w:t xml:space="preserve">   (B) </w:t>
+      </w:r>
+      <w:r>
+        <w:rPr>
+          <w:rFonts w:ascii="Microsoft JhengHei" w:hAnsi="Microsoft JhengHei"/>
+        </w:rPr>
+        <w:t>讀作「等於」，代表兩邊數量相等（一樣多）</w:t>
       </w:r>
     </w:p>
     <w:p>
@@ -2552,7 +3994,13 @@
         <w:rPr>
           <w:rFonts w:ascii="Microsoft JhengHei" w:hAnsi="Microsoft JhengHei"/>
         </w:rPr>
-        <w:t xml:space="preserve">   (C) 讀作「等於」，代表左邊數量比右邊大</w:t>
+        <w:t xml:space="preserve">   (C) </w:t>
+      </w:r>
+      <w:r>
+        <w:rPr>
+          <w:rFonts w:ascii="Microsoft JhengHei" w:hAnsi="Microsoft JhengHei"/>
+        </w:rPr>
+        <w:t>讀作「等於」，代表左邊數量比右邊大</w:t>
       </w:r>
     </w:p>
     <w:p>
@@ -2564,7 +4012,13 @@
         <w:rPr>
           <w:rFonts w:ascii="Microsoft JhengHei" w:hAnsi="Microsoft JhengHei"/>
         </w:rPr>
-        <w:t xml:space="preserve">   (D) 讀作「約等於」，代表兩邊數量差不多</w:t>
+        <w:t xml:space="preserve">   (D) </w:t>
+      </w:r>
+      <w:r>
+        <w:rPr>
+          <w:rFonts w:ascii="Microsoft JhengHei" w:hAnsi="Microsoft JhengHei"/>
+        </w:rPr>
+        <w:t>讀作「約等於」，代表兩邊數量差不多</w:t>
       </w:r>
     </w:p>
     <w:p>
@@ -2576,7 +4030,13 @@
         <w:rPr>
           <w:rFonts w:ascii="Microsoft JhengHei" w:hAnsi="Microsoft JhengHei"/>
         </w:rPr>
-        <w:t>40. 在比較大小的算式「18 &lt; 25」中，關係符號「&lt;」讀作什麼？代表什麼意思？</w:t>
+        <w:t xml:space="preserve">40. </w:t>
+      </w:r>
+      <w:r>
+        <w:rPr>
+          <w:rFonts w:ascii="Microsoft JhengHei" w:hAnsi="Microsoft JhengHei"/>
+        </w:rPr>
+        <w:t>在比較大小的算式「18 &lt; 25」中，關係符號「&lt;」讀作什麼？代表什麼意思？</w:t>
       </w:r>
     </w:p>
     <w:p>
@@ -2588,7 +4048,13 @@
         <w:rPr>
           <w:rFonts w:ascii="Microsoft JhengHei" w:hAnsi="Microsoft JhengHei"/>
         </w:rPr>
-        <w:t xml:space="preserve">   (A) 讀作「小於」，代表 18 比 25 小</w:t>
+        <w:t xml:space="preserve">   (A) </w:t>
+      </w:r>
+      <w:r>
+        <w:rPr>
+          <w:rFonts w:ascii="Microsoft JhengHei" w:hAnsi="Microsoft JhengHei"/>
+        </w:rPr>
+        <w:t>讀作「小於」，代表 18 比 25 小</w:t>
       </w:r>
     </w:p>
     <w:p>
@@ -2600,7 +4066,13 @@
         <w:rPr>
           <w:rFonts w:ascii="Microsoft JhengHei" w:hAnsi="Microsoft JhengHei"/>
         </w:rPr>
-        <w:t xml:space="preserve">   (B) 讀作「大於」，代表 18 比 25 大</w:t>
+        <w:t xml:space="preserve">   (B) </w:t>
+      </w:r>
+      <w:r>
+        <w:rPr>
+          <w:rFonts w:ascii="Microsoft JhengHei" w:hAnsi="Microsoft JhengHei"/>
+        </w:rPr>
+        <w:t>讀作「大於」，代表 18 比 25 大</w:t>
       </w:r>
     </w:p>
     <w:p>
@@ -2612,7 +4084,13 @@
         <w:rPr>
           <w:rFonts w:ascii="Microsoft JhengHei" w:hAnsi="Microsoft JhengHei"/>
         </w:rPr>
-        <w:t xml:space="preserve">   (C) 讀作「等於」，代表兩邊一樣大</w:t>
+        <w:t xml:space="preserve">   (C) </w:t>
+      </w:r>
+      <w:r>
+        <w:rPr>
+          <w:rFonts w:ascii="Microsoft JhengHei" w:hAnsi="Microsoft JhengHei"/>
+        </w:rPr>
+        <w:t>讀作「等於」，代表兩邊一樣大</w:t>
       </w:r>
     </w:p>
     <w:p>
@@ -2624,7 +4102,13 @@
         <w:rPr>
           <w:rFonts w:ascii="Microsoft JhengHei" w:hAnsi="Microsoft JhengHei"/>
         </w:rPr>
-        <w:t xml:space="preserve">   (D) 讀作「減去」，代表 18 減去 25</w:t>
+        <w:t xml:space="preserve">   (D) </w:t>
+      </w:r>
+      <w:r>
+        <w:rPr>
+          <w:rFonts w:ascii="Microsoft JhengHei" w:hAnsi="Microsoft JhengHei"/>
+        </w:rPr>
+        <w:t>讀作「減去」，代表 18 減去 25</w:t>
       </w:r>
     </w:p>
     <w:p>
@@ -2650,7 +4134,13 @@
         <w:rPr>
           <w:rFonts w:ascii="Microsoft JhengHei" w:hAnsi="Microsoft JhengHei"/>
         </w:rPr>
-        <w:t>41. 填填看：如果「5 × 8 = 40」，那麼「8 × 5」是多少？</w:t>
+        <w:t xml:space="preserve">41. </w:t>
+      </w:r>
+      <w:r>
+        <w:rPr>
+          <w:rFonts w:ascii="Microsoft JhengHei" w:hAnsi="Microsoft JhengHei"/>
+        </w:rPr>
+        <w:t>填填看：如果「5 × 8 = 40」，那麼「8 × 5」是多少？</w:t>
       </w:r>
     </w:p>
     <w:p>
@@ -2662,7 +4152,13 @@
         <w:rPr>
           <w:rFonts w:ascii="Microsoft JhengHei" w:hAnsi="Microsoft JhengHei"/>
         </w:rPr>
-        <w:t xml:space="preserve">   (A) 13</w:t>
+        <w:t xml:space="preserve">   (A) </w:t>
+      </w:r>
+      <w:r>
+        <w:rPr>
+          <w:rFonts w:ascii="Microsoft JhengHei" w:hAnsi="Microsoft JhengHei"/>
+        </w:rPr>
+        <w:t>13</w:t>
       </w:r>
     </w:p>
     <w:p>
@@ -2674,7 +4170,13 @@
         <w:rPr>
           <w:rFonts w:ascii="Microsoft JhengHei" w:hAnsi="Microsoft JhengHei"/>
         </w:rPr>
-        <w:t xml:space="preserve">   (B) 35</w:t>
+        <w:t xml:space="preserve">   (B) </w:t>
+      </w:r>
+      <w:r>
+        <w:rPr>
+          <w:rFonts w:ascii="Microsoft JhengHei" w:hAnsi="Microsoft JhengHei"/>
+        </w:rPr>
+        <w:t>35</w:t>
       </w:r>
     </w:p>
     <w:p>
@@ -2686,7 +4188,13 @@
         <w:rPr>
           <w:rFonts w:ascii="Microsoft JhengHei" w:hAnsi="Microsoft JhengHei"/>
         </w:rPr>
-        <w:t xml:space="preserve">   (C) 40</w:t>
+        <w:t xml:space="preserve">   (C) </w:t>
+      </w:r>
+      <w:r>
+        <w:rPr>
+          <w:rFonts w:ascii="Microsoft JhengHei" w:hAnsi="Microsoft JhengHei"/>
+        </w:rPr>
+        <w:t>40</w:t>
       </w:r>
     </w:p>
     <w:p>
@@ -2698,7 +4206,13 @@
         <w:rPr>
           <w:rFonts w:ascii="Microsoft JhengHei" w:hAnsi="Microsoft JhengHei"/>
         </w:rPr>
-        <w:t xml:space="preserve">   (D) 45</w:t>
+        <w:t xml:space="preserve">   (D) </w:t>
+      </w:r>
+      <w:r>
+        <w:rPr>
+          <w:rFonts w:ascii="Microsoft JhengHei" w:hAnsi="Microsoft JhengHei"/>
+        </w:rPr>
+        <w:t>45</w:t>
       </w:r>
     </w:p>
     <w:p>
@@ -2710,7 +4224,13 @@
         <w:rPr>
           <w:rFonts w:ascii="Microsoft JhengHei" w:hAnsi="Microsoft JhengHei"/>
         </w:rPr>
-        <w:t>42. 小明計算「23 + 37 = 60」，妹妹計算「37 + 23」，答案會是多少？這符合什麼規律？</w:t>
+        <w:t xml:space="preserve">42. </w:t>
+      </w:r>
+      <w:r>
+        <w:rPr>
+          <w:rFonts w:ascii="Microsoft JhengHei" w:hAnsi="Microsoft JhengHei"/>
+        </w:rPr>
+        <w:t>小明計算「23 + 37 = 60」，妹妹計算「37 + 23」，答案會是多少？這符合什麼規律？</w:t>
       </w:r>
     </w:p>
     <w:p>
@@ -2722,7 +4242,13 @@
         <w:rPr>
           <w:rFonts w:ascii="Microsoft JhengHei" w:hAnsi="Microsoft JhengHei"/>
         </w:rPr>
-        <w:t xml:space="preserve">   (A) 答案是50，符合加法結合律</w:t>
+        <w:t xml:space="preserve">   (A) </w:t>
+      </w:r>
+      <w:r>
+        <w:rPr>
+          <w:rFonts w:ascii="Microsoft JhengHei" w:hAnsi="Microsoft JhengHei"/>
+        </w:rPr>
+        <w:t>答案是50，符合加法結合律</w:t>
       </w:r>
     </w:p>
     <w:p>
@@ -2734,7 +4260,13 @@
         <w:rPr>
           <w:rFonts w:ascii="Microsoft JhengHei" w:hAnsi="Microsoft JhengHei"/>
         </w:rPr>
-        <w:t xml:space="preserve">   (B) 答案是60，符合加法結合律</w:t>
+        <w:t xml:space="preserve">   (B) </w:t>
+      </w:r>
+      <w:r>
+        <w:rPr>
+          <w:rFonts w:ascii="Microsoft JhengHei" w:hAnsi="Microsoft JhengHei"/>
+        </w:rPr>
+        <w:t>答案是60，符合加法結合律</w:t>
       </w:r>
     </w:p>
     <w:p>
@@ -2746,7 +4278,13 @@
         <w:rPr>
           <w:rFonts w:ascii="Microsoft JhengHei" w:hAnsi="Microsoft JhengHei"/>
         </w:rPr>
-        <w:t xml:space="preserve">   (C) 答案是60，符合加法交換律</w:t>
+        <w:t xml:space="preserve">   (C) </w:t>
+      </w:r>
+      <w:r>
+        <w:rPr>
+          <w:rFonts w:ascii="Microsoft JhengHei" w:hAnsi="Microsoft JhengHei"/>
+        </w:rPr>
+        <w:t>答案是60，符合加法交換律</w:t>
       </w:r>
     </w:p>
     <w:p>
@@ -2758,7 +4296,13 @@
         <w:rPr>
           <w:rFonts w:ascii="Microsoft JhengHei" w:hAnsi="Microsoft JhengHei"/>
         </w:rPr>
-        <w:t xml:space="preserve">   (D) 答案是70，符合加法交換律</w:t>
+        <w:t xml:space="preserve">   (D) </w:t>
+      </w:r>
+      <w:r>
+        <w:rPr>
+          <w:rFonts w:ascii="Microsoft JhengHei" w:hAnsi="Microsoft JhengHei"/>
+        </w:rPr>
+        <w:t>答案是70，符合加法交換律</w:t>
       </w:r>
     </w:p>
     <w:p>
@@ -2770,7 +4314,13 @@
         <w:rPr>
           <w:rFonts w:ascii="Microsoft JhengHei" w:hAnsi="Microsoft JhengHei"/>
         </w:rPr>
-        <w:t>43. 算式「15 + 9 + 5」和「15 + 5 + 9」，得到的答案相同嗎？為什麼？</w:t>
+        <w:t xml:space="preserve">43. </w:t>
+      </w:r>
+      <w:r>
+        <w:rPr>
+          <w:rFonts w:ascii="Microsoft JhengHei" w:hAnsi="Microsoft JhengHei"/>
+        </w:rPr>
+        <w:t>算式「15 + 9 + 5」和「15 + 5 + 9」，得到的答案相同嗎？為什麼？</w:t>
       </w:r>
     </w:p>
     <w:p>
@@ -2782,7 +4332,13 @@
         <w:rPr>
           <w:rFonts w:ascii="Microsoft JhengHei" w:hAnsi="Microsoft JhengHei"/>
         </w:rPr>
-        <w:t xml:space="preserve">   (A) 不相同，因為加數的順序改變了</w:t>
+        <w:t xml:space="preserve">   (A) </w:t>
+      </w:r>
+      <w:r>
+        <w:rPr>
+          <w:rFonts w:ascii="Microsoft JhengHei" w:hAnsi="Microsoft JhengHei"/>
+        </w:rPr>
+        <w:t>不相同，因為加數的順序改變了</w:t>
       </w:r>
     </w:p>
     <w:p>
@@ -2794,7 +4350,13 @@
         <w:rPr>
           <w:rFonts w:ascii="Microsoft JhengHei" w:hAnsi="Microsoft JhengHei"/>
         </w:rPr>
-        <w:t xml:space="preserve">   (B) 相同，因為符合加法結合律</w:t>
+        <w:t xml:space="preserve">   (B) </w:t>
+      </w:r>
+      <w:r>
+        <w:rPr>
+          <w:rFonts w:ascii="Microsoft JhengHei" w:hAnsi="Microsoft JhengHei"/>
+        </w:rPr>
+        <w:t>相同，因為符合加法結合律</w:t>
       </w:r>
     </w:p>
     <w:p>
@@ -2806,7 +4368,13 @@
         <w:rPr>
           <w:rFonts w:ascii="Microsoft JhengHei" w:hAnsi="Microsoft JhengHei"/>
         </w:rPr>
-        <w:t xml:space="preserve">   (C) 相同，因為符合加法交換律，且先算 15 + 5 湊整會更快</w:t>
+        <w:t xml:space="preserve">   (C) </w:t>
+      </w:r>
+      <w:r>
+        <w:rPr>
+          <w:rFonts w:ascii="Microsoft JhengHei" w:hAnsi="Microsoft JhengHei"/>
+        </w:rPr>
+        <w:t>相同，因為符合加法交換律，且先算 15 + 5 湊整會更快</w:t>
       </w:r>
     </w:p>
     <w:p>
@@ -2818,7 +4386,13 @@
         <w:rPr>
           <w:rFonts w:ascii="Microsoft JhengHei" w:hAnsi="Microsoft JhengHei"/>
         </w:rPr>
-        <w:t xml:space="preserve">   (D) 不相同，因為加數的位置不同，答案也會跟著變</w:t>
+        <w:t xml:space="preserve">   (D) </w:t>
+      </w:r>
+      <w:r>
+        <w:rPr>
+          <w:rFonts w:ascii="Microsoft JhengHei" w:hAnsi="Microsoft JhengHei"/>
+        </w:rPr>
+        <w:t>不相同，因為加數的位置不同，答案也會跟著變</w:t>
       </w:r>
     </w:p>
     <w:p>
@@ -2844,7 +4418,13 @@
         <w:rPr>
           <w:rFonts w:ascii="Microsoft JhengHei" w:hAnsi="Microsoft JhengHei"/>
         </w:rPr>
-        <w:t>44. 小明有一些零用錢，買了一枝25元的原子筆後還剩下15元，小明原本有多少元？請選出正確的括號算式與答案。</w:t>
+        <w:t xml:space="preserve">44. </w:t>
+      </w:r>
+      <w:r>
+        <w:rPr>
+          <w:rFonts w:ascii="Microsoft JhengHei" w:hAnsi="Microsoft JhengHei"/>
+        </w:rPr>
+        <w:t>小明有一些零用錢，買了一枝25元的原子筆後還剩下15元，小明原本有多少元？請選出正確的括號算式與答案。</w:t>
       </w:r>
     </w:p>
     <w:p>
@@ -2856,7 +4436,13 @@
         <w:rPr>
           <w:rFonts w:ascii="Microsoft JhengHei" w:hAnsi="Microsoft JhengHei"/>
         </w:rPr>
-        <w:t xml:space="preserve">   (A) ( ) - 25 = 15，答案是 40元</w:t>
+        <w:t xml:space="preserve">   (A) </w:t>
+      </w:r>
+      <w:r>
+        <w:rPr>
+          <w:rFonts w:ascii="Microsoft JhengHei" w:hAnsi="Microsoft JhengHei"/>
+        </w:rPr>
+        <w:t>( ) - 25 = 15，答案是 40元</w:t>
       </w:r>
     </w:p>
     <w:p>
@@ -2868,7 +4454,13 @@
         <w:rPr>
           <w:rFonts w:ascii="Microsoft JhengHei" w:hAnsi="Microsoft JhengHei"/>
         </w:rPr>
-        <w:t xml:space="preserve">   (B) 25 - ( ) = 15，答案是 10元</w:t>
+        <w:t xml:space="preserve">   (B) </w:t>
+      </w:r>
+      <w:r>
+        <w:rPr>
+          <w:rFonts w:ascii="Microsoft JhengHei" w:hAnsi="Microsoft JhengHei"/>
+        </w:rPr>
+        <w:t>25 - ( ) = 15，答案是 10元</w:t>
       </w:r>
     </w:p>
     <w:p>
@@ -2880,7 +4472,13 @@
         <w:rPr>
           <w:rFonts w:ascii="Microsoft JhengHei" w:hAnsi="Microsoft JhengHei"/>
         </w:rPr>
-        <w:t xml:space="preserve">   (C) ( ) + 25 = 15，答案是 40元</w:t>
+        <w:t xml:space="preserve">   (C) </w:t>
+      </w:r>
+      <w:r>
+        <w:rPr>
+          <w:rFonts w:ascii="Microsoft JhengHei" w:hAnsi="Microsoft JhengHei"/>
+        </w:rPr>
+        <w:t>( ) + 25 = 15，答案是 40元</w:t>
       </w:r>
     </w:p>
     <w:p>
@@ -2892,7 +4490,13 @@
         <w:rPr>
           <w:rFonts w:ascii="Microsoft JhengHei" w:hAnsi="Microsoft JhengHei"/>
         </w:rPr>
-        <w:t xml:space="preserve">   (D) ( ) - 15 = 25，答案是 10元</w:t>
+        <w:t xml:space="preserve">   (D) </w:t>
+      </w:r>
+      <w:r>
+        <w:rPr>
+          <w:rFonts w:ascii="Microsoft JhengHei" w:hAnsi="Microsoft JhengHei"/>
+        </w:rPr>
+        <w:t>( ) - 15 = 25，答案是 10元</w:t>
       </w:r>
     </w:p>
     <w:p>
@@ -2904,7 +4508,13 @@
         <w:rPr>
           <w:rFonts w:ascii="Microsoft JhengHei" w:hAnsi="Microsoft JhengHei"/>
         </w:rPr>
-        <w:t>45. 停車場原本有幾輛車不知道，開走了14輛後，還剩下18輛。停車場原本有幾輛車？</w:t>
+        <w:t xml:space="preserve">45. </w:t>
+      </w:r>
+      <w:r>
+        <w:rPr>
+          <w:rFonts w:ascii="Microsoft JhengHei" w:hAnsi="Microsoft JhengHei"/>
+        </w:rPr>
+        <w:t>停車場原本有幾輛車不知道，開走了14輛後，還剩下18輛。停車場原本有幾輛車？</w:t>
       </w:r>
     </w:p>
     <w:p>
@@ -2916,7 +4526,13 @@
         <w:rPr>
           <w:rFonts w:ascii="Microsoft JhengHei" w:hAnsi="Microsoft JhengHei"/>
         </w:rPr>
-        <w:t xml:space="preserve">   (A) 4輛</w:t>
+        <w:t xml:space="preserve">   (A) </w:t>
+      </w:r>
+      <w:r>
+        <w:rPr>
+          <w:rFonts w:ascii="Microsoft JhengHei" w:hAnsi="Microsoft JhengHei"/>
+        </w:rPr>
+        <w:t>4輛</w:t>
       </w:r>
     </w:p>
     <w:p>
@@ -2928,7 +4544,13 @@
         <w:rPr>
           <w:rFonts w:ascii="Microsoft JhengHei" w:hAnsi="Microsoft JhengHei"/>
         </w:rPr>
-        <w:t xml:space="preserve">   (B) 22輛</w:t>
+        <w:t xml:space="preserve">   (B) </w:t>
+      </w:r>
+      <w:r>
+        <w:rPr>
+          <w:rFonts w:ascii="Microsoft JhengHei" w:hAnsi="Microsoft JhengHei"/>
+        </w:rPr>
+        <w:t>22輛</w:t>
       </w:r>
     </w:p>
     <w:p>
@@ -2940,7 +4562,13 @@
         <w:rPr>
           <w:rFonts w:ascii="Microsoft JhengHei" w:hAnsi="Microsoft JhengHei"/>
         </w:rPr>
-        <w:t xml:space="preserve">   (C) 32輛</w:t>
+        <w:t xml:space="preserve">   (C) </w:t>
+      </w:r>
+      <w:r>
+        <w:rPr>
+          <w:rFonts w:ascii="Microsoft JhengHei" w:hAnsi="Microsoft JhengHei"/>
+        </w:rPr>
+        <w:t>32輛</w:t>
       </w:r>
     </w:p>
     <w:p>
@@ -2952,7 +4580,13 @@
         <w:rPr>
           <w:rFonts w:ascii="Microsoft JhengHei" w:hAnsi="Microsoft JhengHei"/>
         </w:rPr>
-        <w:t xml:space="preserve">   (D) 34輛</w:t>
+        <w:t xml:space="preserve">   (D) </w:t>
+      </w:r>
+      <w:r>
+        <w:rPr>
+          <w:rFonts w:ascii="Microsoft JhengHei" w:hAnsi="Microsoft JhengHei"/>
+        </w:rPr>
+        <w:t>34輛</w:t>
       </w:r>
     </w:p>
     <w:p>
@@ -2964,7 +4598,13 @@
         <w:rPr>
           <w:rFonts w:ascii="Microsoft JhengHei" w:hAnsi="Microsoft JhengHei"/>
         </w:rPr>
-        <w:t>46. 算式「60 - ( ) = 24」，括號裡的數是多少？要怎麼算出來？</w:t>
+        <w:t xml:space="preserve">46. </w:t>
+      </w:r>
+      <w:r>
+        <w:rPr>
+          <w:rFonts w:ascii="Microsoft JhengHei" w:hAnsi="Microsoft JhengHei"/>
+        </w:rPr>
+        <w:t>算式「60 - ( ) = 24」，括號裡的數是多少？要怎麼算出來？</w:t>
       </w:r>
     </w:p>
     <w:p>
@@ -2976,7 +4616,13 @@
         <w:rPr>
           <w:rFonts w:ascii="Microsoft JhengHei" w:hAnsi="Microsoft JhengHei"/>
         </w:rPr>
-        <w:t xml:space="preserve">   (A) 84，算式是 60 + 24</w:t>
+        <w:t xml:space="preserve">   (A) </w:t>
+      </w:r>
+      <w:r>
+        <w:rPr>
+          <w:rFonts w:ascii="Microsoft JhengHei" w:hAnsi="Microsoft JhengHei"/>
+        </w:rPr>
+        <w:t>84，算式是 60 + 24</w:t>
       </w:r>
     </w:p>
     <w:p>
@@ -2988,7 +4634,13 @@
         <w:rPr>
           <w:rFonts w:ascii="Microsoft JhengHei" w:hAnsi="Microsoft JhengHei"/>
         </w:rPr>
-        <w:t xml:space="preserve">   (B) 36，算式是 60 - 24</w:t>
+        <w:t xml:space="preserve">   (B) </w:t>
+      </w:r>
+      <w:r>
+        <w:rPr>
+          <w:rFonts w:ascii="Microsoft JhengHei" w:hAnsi="Microsoft JhengHei"/>
+        </w:rPr>
+        <w:t>36，算式是 60 - 24</w:t>
       </w:r>
     </w:p>
     <w:p>
@@ -3000,7 +4652,13 @@
         <w:rPr>
           <w:rFonts w:ascii="Microsoft JhengHei" w:hAnsi="Microsoft JhengHei"/>
         </w:rPr>
-        <w:t xml:space="preserve">   (C) 46，算式是 60 - 24</w:t>
+        <w:t xml:space="preserve">   (C) </w:t>
+      </w:r>
+      <w:r>
+        <w:rPr>
+          <w:rFonts w:ascii="Microsoft JhengHei" w:hAnsi="Microsoft JhengHei"/>
+        </w:rPr>
+        <w:t>46，算式是 60 - 24</w:t>
       </w:r>
     </w:p>
     <w:p>
@@ -3012,7 +4670,13 @@
         <w:rPr>
           <w:rFonts w:ascii="Microsoft JhengHei" w:hAnsi="Microsoft JhengHei"/>
         </w:rPr>
-        <w:t xml:space="preserve">   (D) 36，算式是 24 + 60</w:t>
+        <w:t xml:space="preserve">   (D) </w:t>
+      </w:r>
+      <w:r>
+        <w:rPr>
+          <w:rFonts w:ascii="Microsoft JhengHei" w:hAnsi="Microsoft JhengHei"/>
+        </w:rPr>
+        <w:t>36，算式是 24 + 60</w:t>
       </w:r>
     </w:p>
     <w:p>
@@ -3038,7 +4702,13 @@
         <w:rPr>
           <w:rFonts w:ascii="Microsoft JhengHei" w:hAnsi="Microsoft JhengHei"/>
         </w:rPr>
-        <w:t>47. 在數學上，我們做垃圾分類（如紙類、塑膠、一般垃圾），主要和下列哪一個數學概念關係最密切？</w:t>
+        <w:t xml:space="preserve">47. </w:t>
+      </w:r>
+      <w:r>
+        <w:rPr>
+          <w:rFonts w:ascii="Microsoft JhengHei" w:hAnsi="Microsoft JhengHei"/>
+        </w:rPr>
+        <w:t>在數學上，我們做垃圾分類（如紙類、塑膠、一般垃圾），主要和下列哪一個數學概念關係最密切？</w:t>
       </w:r>
     </w:p>
     <w:p>
@@ -3050,7 +4720,13 @@
         <w:rPr>
           <w:rFonts w:ascii="Microsoft JhengHei" w:hAnsi="Microsoft JhengHei"/>
         </w:rPr>
-        <w:t xml:space="preserve">   (A) 測量長度</w:t>
+        <w:t xml:space="preserve">   (A) </w:t>
+      </w:r>
+      <w:r>
+        <w:rPr>
+          <w:rFonts w:ascii="Microsoft JhengHei" w:hAnsi="Microsoft JhengHei"/>
+        </w:rPr>
+        <w:t>測量長度</w:t>
       </w:r>
     </w:p>
     <w:p>
@@ -3062,7 +4738,13 @@
         <w:rPr>
           <w:rFonts w:ascii="Microsoft JhengHei" w:hAnsi="Microsoft JhengHei"/>
         </w:rPr>
-        <w:t xml:space="preserve">   (B) 加減計算</w:t>
+        <w:t xml:space="preserve">   (B) </w:t>
+      </w:r>
+      <w:r>
+        <w:rPr>
+          <w:rFonts w:ascii="Microsoft JhengHei" w:hAnsi="Microsoft JhengHei"/>
+        </w:rPr>
+        <w:t>加減計算</w:t>
       </w:r>
     </w:p>
     <w:p>
@@ -3074,7 +4756,13 @@
         <w:rPr>
           <w:rFonts w:ascii="Microsoft JhengHei" w:hAnsi="Microsoft JhengHei"/>
         </w:rPr>
-        <w:t xml:space="preserve">   (C) 蒐集與整理數據的第一步（分類與統計）</w:t>
+        <w:t xml:space="preserve">   (C) </w:t>
+      </w:r>
+      <w:r>
+        <w:rPr>
+          <w:rFonts w:ascii="Microsoft JhengHei" w:hAnsi="Microsoft JhengHei"/>
+        </w:rPr>
+        <w:t>蒐集與整理數據的第一步（分類與統計）</w:t>
       </w:r>
     </w:p>
     <w:p>
@@ -3086,7 +4774,13 @@
         <w:rPr>
           <w:rFonts w:ascii="Microsoft JhengHei" w:hAnsi="Microsoft JhengHei"/>
         </w:rPr>
-        <w:t xml:space="preserve">   (D) 認識立體圖形</w:t>
+        <w:t xml:space="preserve">   (D) </w:t>
+      </w:r>
+      <w:r>
+        <w:rPr>
+          <w:rFonts w:ascii="Microsoft JhengHei" w:hAnsi="Microsoft JhengHei"/>
+        </w:rPr>
+        <w:t>認識立體圖形</w:t>
       </w:r>
     </w:p>
     <w:p>
@@ -3098,7 +4792,13 @@
         <w:rPr>
           <w:rFonts w:ascii="Microsoft JhengHei" w:hAnsi="Microsoft JhengHei"/>
         </w:rPr>
-        <w:t>48. 抽屜裡有3支紅筆、5支藍筆和4支黑筆。哪一個分類統計表最能正確呈現這些資料？</w:t>
+        <w:t xml:space="preserve">48. </w:t>
+      </w:r>
+      <w:r>
+        <w:rPr>
+          <w:rFonts w:ascii="Microsoft JhengHei" w:hAnsi="Microsoft JhengHei"/>
+        </w:rPr>
+        <w:t>抽屜裡有3支紅筆、5支藍筆和4支黑筆。哪一個分類統計表最能正確呈現這些資料？</w:t>
       </w:r>
     </w:p>
     <w:p>
@@ -3110,7 +4810,13 @@
         <w:rPr>
           <w:rFonts w:ascii="Microsoft JhengHei" w:hAnsi="Microsoft JhengHei"/>
         </w:rPr>
-        <w:t xml:space="preserve">   (A) 紅筆：5支；藍筆：3支；黑筆：4支</w:t>
+        <w:t xml:space="preserve">   (A) </w:t>
+      </w:r>
+      <w:r>
+        <w:rPr>
+          <w:rFonts w:ascii="Microsoft JhengHei" w:hAnsi="Microsoft JhengHei"/>
+        </w:rPr>
+        <w:t>紅筆：5支；藍筆：3支；黑筆：4支</w:t>
       </w:r>
     </w:p>
     <w:p>
@@ -3122,7 +4828,13 @@
         <w:rPr>
           <w:rFonts w:ascii="Microsoft JhengHei" w:hAnsi="Microsoft JhengHei"/>
         </w:rPr>
-        <w:t xml:space="preserve">   (B) 紅筆：3支；藍筆：4支；黑筆：5支</w:t>
+        <w:t xml:space="preserve">   (B) </w:t>
+      </w:r>
+      <w:r>
+        <w:rPr>
+          <w:rFonts w:ascii="Microsoft JhengHei" w:hAnsi="Microsoft JhengHei"/>
+        </w:rPr>
+        <w:t>紅筆：3支；藍筆：4支；黑筆：5支</w:t>
       </w:r>
     </w:p>
     <w:p>
@@ -3134,7 +4846,13 @@
         <w:rPr>
           <w:rFonts w:ascii="Microsoft JhengHei" w:hAnsi="Microsoft JhengHei"/>
         </w:rPr>
-        <w:t xml:space="preserve">   (C) 紅筆：3支；藍筆：5支；黑筆：4支</w:t>
+        <w:t xml:space="preserve">   (C) </w:t>
+      </w:r>
+      <w:r>
+        <w:rPr>
+          <w:rFonts w:ascii="Microsoft JhengHei" w:hAnsi="Microsoft JhengHei"/>
+        </w:rPr>
+        <w:t>紅筆：3支；藍筆：5支；黑筆：4支</w:t>
       </w:r>
     </w:p>
     <w:p>
@@ -3146,7 +4864,13 @@
         <w:rPr>
           <w:rFonts w:ascii="Microsoft JhengHei" w:hAnsi="Microsoft JhengHei"/>
         </w:rPr>
-        <w:t xml:space="preserve">   (D) 紅筆：4支；藍筆：5支；黑筆：3支</w:t>
+        <w:t xml:space="preserve">   (D) </w:t>
+      </w:r>
+      <w:r>
+        <w:rPr>
+          <w:rFonts w:ascii="Microsoft JhengHei" w:hAnsi="Microsoft JhengHei"/>
+        </w:rPr>
+        <w:t>紅筆：4支；藍筆：5支；黑筆：3支</w:t>
       </w:r>
     </w:p>
     <w:p>
@@ -3158,7 +4882,13 @@
         <w:rPr>
           <w:rFonts w:ascii="Microsoft JhengHei" w:hAnsi="Microsoft JhengHei"/>
         </w:rPr>
-        <w:t>49. 小明記錄今天路上經過的車輛：公車有「正」（5輛），機車有「正正正」（15輛），卡車有三條直線（3輛）。請把這三種車子的數量由多到少排序：</w:t>
+        <w:t xml:space="preserve">49. </w:t>
+      </w:r>
+      <w:r>
+        <w:rPr>
+          <w:rFonts w:ascii="Microsoft JhengHei" w:hAnsi="Microsoft JhengHei"/>
+        </w:rPr>
+        <w:t>小明記錄今天路上經過的車輛：公車有「正」（5輛），機車有「正正正」（15輛），卡車有三條直線（3輛）。請把這三種車子的數量由多到少排序：</w:t>
       </w:r>
     </w:p>
     <w:p>
@@ -3170,7 +4900,13 @@
         <w:rPr>
           <w:rFonts w:ascii="Microsoft JhengHei" w:hAnsi="Microsoft JhengHei"/>
         </w:rPr>
-        <w:t xml:space="preserve">   (A) 機車 &gt; 公車 &gt; 卡車</w:t>
+        <w:t xml:space="preserve">   (A) </w:t>
+      </w:r>
+      <w:r>
+        <w:rPr>
+          <w:rFonts w:ascii="Microsoft JhengHei" w:hAnsi="Microsoft JhengHei"/>
+        </w:rPr>
+        <w:t>機車 &gt; 公車 &gt; 卡車</w:t>
       </w:r>
     </w:p>
     <w:p>
@@ -3182,7 +4918,13 @@
         <w:rPr>
           <w:rFonts w:ascii="Microsoft JhengHei" w:hAnsi="Microsoft JhengHei"/>
         </w:rPr>
-        <w:t xml:space="preserve">   (B) 卡車 &gt; 公車 &gt; 機車</w:t>
+        <w:t xml:space="preserve">   (B) </w:t>
+      </w:r>
+      <w:r>
+        <w:rPr>
+          <w:rFonts w:ascii="Microsoft JhengHei" w:hAnsi="Microsoft JhengHei"/>
+        </w:rPr>
+        <w:t>卡車 &gt; 公車 &gt; 機車</w:t>
       </w:r>
     </w:p>
     <w:p>
@@ -3194,7 +4936,13 @@
         <w:rPr>
           <w:rFonts w:ascii="Microsoft JhengHei" w:hAnsi="Microsoft JhengHei"/>
         </w:rPr>
-        <w:t xml:space="preserve">   (C) 公車 &gt; 機車 &gt; 卡車</w:t>
+        <w:t xml:space="preserve">   (C) </w:t>
+      </w:r>
+      <w:r>
+        <w:rPr>
+          <w:rFonts w:ascii="Microsoft JhengHei" w:hAnsi="Microsoft JhengHei"/>
+        </w:rPr>
+        <w:t>公車 &gt; 機車 &gt; 卡車</w:t>
       </w:r>
     </w:p>
     <w:p>
@@ -3206,7 +4954,13 @@
         <w:rPr>
           <w:rFonts w:ascii="Microsoft JhengHei" w:hAnsi="Microsoft JhengHei"/>
         </w:rPr>
-        <w:t xml:space="preserve">   (D) 機車 &gt; 卡車 &gt; 公車</w:t>
+        <w:t xml:space="preserve">   (D) </w:t>
+      </w:r>
+      <w:r>
+        <w:rPr>
+          <w:rFonts w:ascii="Microsoft JhengHei" w:hAnsi="Microsoft JhengHei"/>
+        </w:rPr>
+        <w:t>機車 &gt; 卡車 &gt; 公車</w:t>
       </w:r>
     </w:p>
     <w:p>
@@ -3218,7 +4972,13 @@
         <w:rPr>
           <w:rFonts w:ascii="Microsoft JhengHei" w:hAnsi="Microsoft JhengHei"/>
         </w:rPr>
-        <w:t>50. 老師把一箱玩具分類，玩偶有14個、積木有20個、小汽車有8個。哪一種玩具最少？積木比小汽車多幾個？</w:t>
+        <w:t xml:space="preserve">50. </w:t>
+      </w:r>
+      <w:r>
+        <w:rPr>
+          <w:rFonts w:ascii="Microsoft JhengHei" w:hAnsi="Microsoft JhengHei"/>
+        </w:rPr>
+        <w:t>老師把一箱玩具分類，玩偶有14個、積木有20個、小汽車有8個。哪一種玩具最少？積木比小汽車多幾個？</w:t>
       </w:r>
     </w:p>
     <w:p>
@@ -3230,7 +4990,13 @@
         <w:rPr>
           <w:rFonts w:ascii="Microsoft JhengHei" w:hAnsi="Microsoft JhengHei"/>
         </w:rPr>
-        <w:t xml:space="preserve">   (A) 玩偶最少；多6個</w:t>
+        <w:t xml:space="preserve">   (A) </w:t>
+      </w:r>
+      <w:r>
+        <w:rPr>
+          <w:rFonts w:ascii="Microsoft JhengHei" w:hAnsi="Microsoft JhengHei"/>
+        </w:rPr>
+        <w:t>玩偶最少；多6個</w:t>
       </w:r>
     </w:p>
     <w:p>
@@ -3242,7 +5008,13 @@
         <w:rPr>
           <w:rFonts w:ascii="Microsoft JhengHei" w:hAnsi="Microsoft JhengHei"/>
         </w:rPr>
-        <w:t xml:space="preserve">   (B) 小汽車最少；多12個</w:t>
+        <w:t xml:space="preserve">   (B) </w:t>
+      </w:r>
+      <w:r>
+        <w:rPr>
+          <w:rFonts w:ascii="Microsoft JhengHei" w:hAnsi="Microsoft JhengHei"/>
+        </w:rPr>
+        <w:t>小汽車最少；多12個</w:t>
       </w:r>
     </w:p>
     <w:p>
@@ -3254,7 +5026,13 @@
         <w:rPr>
           <w:rFonts w:ascii="Microsoft JhengHei" w:hAnsi="Microsoft JhengHei"/>
         </w:rPr>
-        <w:t xml:space="preserve">   (C) 小汽車最少；多6個</w:t>
+        <w:t xml:space="preserve">   (C) </w:t>
+      </w:r>
+      <w:r>
+        <w:rPr>
+          <w:rFonts w:ascii="Microsoft JhengHei" w:hAnsi="Microsoft JhengHei"/>
+        </w:rPr>
+        <w:t>小汽車最少；多6個</w:t>
       </w:r>
     </w:p>
     <w:p>
@@ -3266,7 +5044,13 @@
         <w:rPr>
           <w:rFonts w:ascii="Microsoft JhengHei" w:hAnsi="Microsoft JhengHei"/>
         </w:rPr>
-        <w:t xml:space="preserve">   (D) 積木最少；多12個</w:t>
+        <w:t xml:space="preserve">   (D) </w:t>
+      </w:r>
+      <w:r>
+        <w:rPr>
+          <w:rFonts w:ascii="Microsoft JhengHei" w:hAnsi="Microsoft JhengHei"/>
+        </w:rPr>
+        <w:t>積木最少；多12個</w:t>
       </w:r>
     </w:p>
     <w:p>

</xml_diff>

<commit_message>
Fix fraction regex matching for adjacent Chinese characters in DOCX
</commit_message>
<xml_diff>
--- a/白堊紀冒險營_數學測驗50題.docx
+++ b/白堊紀冒險營_數學測驗50題.docx
@@ -1974,11 +1974,28 @@
         </w:rPr>
         <w:t xml:space="preserve">   (A) </w:t>
       </w:r>
-      <w:r>
-        <w:rPr>
-          <w:rFonts w:ascii="Microsoft JhengHei" w:hAnsi="Microsoft JhengHei"/>
-        </w:rPr>
-        <w:t>1/8個</w:t>
+      <m:oMath>
+        <m:f>
+          <m:fPr>
+            <m:type m:val="bar"/>
+          </m:fPr>
+          <m:num>
+            <m:r>
+              <m:t>1</m:t>
+            </m:r>
+          </m:num>
+          <m:den>
+            <m:r>
+              <m:t>8</m:t>
+            </m:r>
+          </m:den>
+        </m:f>
+      </m:oMath>
+      <w:r>
+        <w:rPr>
+          <w:rFonts w:ascii="Microsoft JhengHei" w:hAnsi="Microsoft JhengHei"/>
+        </w:rPr>
+        <w:t>個</w:t>
       </w:r>
     </w:p>
     <w:p>
@@ -1992,11 +2009,28 @@
         </w:rPr>
         <w:t xml:space="preserve">   (B) </w:t>
       </w:r>
-      <w:r>
-        <w:rPr>
-          <w:rFonts w:ascii="Microsoft JhengHei" w:hAnsi="Microsoft JhengHei"/>
-        </w:rPr>
-        <w:t>7/8個</w:t>
+      <m:oMath>
+        <m:f>
+          <m:fPr>
+            <m:type m:val="bar"/>
+          </m:fPr>
+          <m:num>
+            <m:r>
+              <m:t>7</m:t>
+            </m:r>
+          </m:num>
+          <m:den>
+            <m:r>
+              <m:t>8</m:t>
+            </m:r>
+          </m:den>
+        </m:f>
+      </m:oMath>
+      <w:r>
+        <w:rPr>
+          <w:rFonts w:ascii="Microsoft JhengHei" w:hAnsi="Microsoft JhengHei"/>
+        </w:rPr>
+        <w:t>個</w:t>
       </w:r>
     </w:p>
     <w:p>

</xml_diff>

<commit_message>
Update time questions wording from 點 to 時 in questions.js and docx
</commit_message>
<xml_diff>
--- a/白堊紀冒險營_數學測驗50題.docx
+++ b/白堊紀冒險營_數學測驗50題.docx
@@ -3136,7 +3136,7 @@
         <w:rPr>
           <w:rFonts w:ascii="Microsoft JhengHei" w:hAnsi="Microsoft JhengHei"/>
         </w:rPr>
-        <w:t>小明下午 4 點 15 分放學，這時候的時鐘應該是哪一個？</w:t>
+        <w:t>小明下午 4 時 15 分放學，這時候的時鐘應該是哪一個？</w:t>
       </w:r>
     </w:p>
     <w:p>
@@ -3447,7 +3447,7 @@
         <w:rPr>
           <w:rFonts w:ascii="Microsoft JhengHei" w:hAnsi="Microsoft JhengHei"/>
         </w:rPr>
-        <w:t>小美早上8點開始上課，到中午12點吃午餐。她一共上了幾個小時的課？</w:t>
+        <w:t>小美早上8時開始上課，到中午12時吃午餐。她一共上了幾個小時的課？</w:t>
       </w:r>
     </w:p>
     <w:p>

</xml_diff>